<commit_message>
Auto save docs: WM Montagens Industriais/_qrcodes/nr 10 (40) (WM)_qrcode.png
</commit_message>
<xml_diff>
--- a/WM Montagens Industriais/nr 10 (40) (WM).docx
+++ b/WM Montagens Industriais/nr 10 (40) (WM).docx
@@ -218,7 +218,28 @@
                 <w:sz w:val="26"/>
                 <w:szCs w:val="26"/>
               </w:rPr>
-              <w:t>Obteve aproveitamento satisfatório no curso de capacitação em</w:t>
+              <w:t>Colaborador da empresa1, o</w:t>
+            </w:r>
+            <w:r>
+              <w:rPr>
+                <w:sz w:val="26"/>
+                <w:szCs w:val="26"/>
+              </w:rPr>
+              <w:t>bteve</w:t>
+            </w:r>
+            <w:r>
+              <w:rPr>
+                <w:sz w:val="26"/>
+                <w:szCs w:val="26"/>
+              </w:rPr>
+              <w:t xml:space="preserve"> </w:t>
+            </w:r>
+            <w:r>
+              <w:rPr>
+                <w:sz w:val="26"/>
+                <w:szCs w:val="26"/>
+              </w:rPr>
+              <w:t>aproveitamento satisfatório no curso de capacitação em</w:t>
             </w:r>
             <w:r>
               <w:rPr>
@@ -243,7 +264,7 @@
                 <w:sz w:val="26"/>
                 <w:szCs w:val="26"/>
               </w:rPr>
-              <w:t>SEGURANÇA EM INSTALAÇÕES E SERVIÇOS EM ELETRICIDADE</w:t>
+              <w:t xml:space="preserve">NR 10 - </w:t>
             </w:r>
             <w:r>
               <w:rPr>
@@ -252,55 +273,7 @@
                 <w:sz w:val="26"/>
                 <w:szCs w:val="26"/>
               </w:rPr>
-              <w:t>”</w:t>
-            </w:r>
-            <w:r>
-              <w:rPr>
-                <w:sz w:val="26"/>
-                <w:szCs w:val="26"/>
-              </w:rPr>
-              <w:t>.</w:t>
-            </w:r>
-            <w:r>
-              <w:t xml:space="preserve"> </w:t>
-            </w:r>
-            <w:r>
-              <w:t xml:space="preserve">Aplicado </w:t>
-            </w:r>
-            <w:r>
-              <w:t>c</w:t>
-            </w:r>
-            <w:r>
-              <w:t xml:space="preserve">onforme as exigências da NR 10 e anexo III da Portaria </w:t>
-            </w:r>
-            <w:proofErr w:type="spellStart"/>
-            <w:r>
-              <w:t>MTb</w:t>
-            </w:r>
-            <w:proofErr w:type="spellEnd"/>
-            <w:r>
-              <w:t xml:space="preserve"> nº 3.214/1978</w:t>
-            </w:r>
-            <w:r>
-              <w:rPr>
-                <w:sz w:val="26"/>
-                <w:szCs w:val="26"/>
-              </w:rPr>
-              <w:t>,</w:t>
-            </w:r>
-            <w:r>
-              <w:rPr>
-                <w:sz w:val="26"/>
-                <w:szCs w:val="26"/>
-              </w:rPr>
-              <w:t xml:space="preserve"> </w:t>
-            </w:r>
-            <w:r>
-              <w:rPr>
-                <w:sz w:val="26"/>
-                <w:szCs w:val="26"/>
-              </w:rPr>
-              <w:t xml:space="preserve">com carga horária de </w:t>
+              <w:t>SEGURANÇA EM INSTALAÇÕES E SERVIÇOS EM ELETRICIDADE</w:t>
             </w:r>
             <w:r>
               <w:rPr>
@@ -309,7 +282,55 @@
                 <w:sz w:val="26"/>
                 <w:szCs w:val="26"/>
               </w:rPr>
-              <w:t>40</w:t>
+              <w:t>”</w:t>
+            </w:r>
+            <w:r>
+              <w:rPr>
+                <w:sz w:val="26"/>
+                <w:szCs w:val="26"/>
+              </w:rPr>
+              <w:t>.</w:t>
+            </w:r>
+            <w:r>
+              <w:t xml:space="preserve"> </w:t>
+            </w:r>
+            <w:r>
+              <w:t xml:space="preserve">Aplicado </w:t>
+            </w:r>
+            <w:r>
+              <w:t>c</w:t>
+            </w:r>
+            <w:r>
+              <w:t xml:space="preserve">onforme as exigências da NR 10 e anexo III da Portaria </w:t>
+            </w:r>
+            <w:proofErr w:type="spellStart"/>
+            <w:r>
+              <w:t>MTb</w:t>
+            </w:r>
+            <w:proofErr w:type="spellEnd"/>
+            <w:r>
+              <w:t xml:space="preserve"> nº 3.214/1978</w:t>
+            </w:r>
+            <w:r>
+              <w:rPr>
+                <w:sz w:val="26"/>
+                <w:szCs w:val="26"/>
+              </w:rPr>
+              <w:t>,</w:t>
+            </w:r>
+            <w:r>
+              <w:rPr>
+                <w:sz w:val="26"/>
+                <w:szCs w:val="26"/>
+              </w:rPr>
+              <w:t xml:space="preserve"> </w:t>
+            </w:r>
+            <w:r>
+              <w:rPr>
+                <w:sz w:val="26"/>
+                <w:szCs w:val="26"/>
+              </w:rPr>
+              <w:t xml:space="preserve">com carga horária de </w:t>
             </w:r>
             <w:r>
               <w:rPr>
@@ -318,28 +339,7 @@
                 <w:sz w:val="26"/>
                 <w:szCs w:val="26"/>
               </w:rPr>
-              <w:t xml:space="preserve"> horas</w:t>
-            </w:r>
-            <w:r>
-              <w:rPr>
-                <w:sz w:val="26"/>
-                <w:szCs w:val="26"/>
-              </w:rPr>
-              <w:t xml:space="preserve"> e realizado no</w:t>
-            </w:r>
-            <w:r>
-              <w:rPr>
-                <w:sz w:val="26"/>
-                <w:szCs w:val="26"/>
-              </w:rPr>
-              <w:t xml:space="preserve"> período de</w:t>
-            </w:r>
-            <w:r>
-              <w:rPr>
-                <w:sz w:val="26"/>
-                <w:szCs w:val="26"/>
-              </w:rPr>
-              <w:t xml:space="preserve"> </w:t>
+              <w:t>40</w:t>
             </w:r>
             <w:r>
               <w:rPr>
@@ -348,7 +348,28 @@
                 <w:sz w:val="26"/>
                 <w:szCs w:val="26"/>
               </w:rPr>
-              <w:t xml:space="preserve">começo1 a </w:t>
+              <w:t xml:space="preserve"> horas</w:t>
+            </w:r>
+            <w:r>
+              <w:rPr>
+                <w:sz w:val="26"/>
+                <w:szCs w:val="26"/>
+              </w:rPr>
+              <w:t xml:space="preserve"> e realizado no</w:t>
+            </w:r>
+            <w:r>
+              <w:rPr>
+                <w:sz w:val="26"/>
+                <w:szCs w:val="26"/>
+              </w:rPr>
+              <w:t xml:space="preserve"> período de</w:t>
+            </w:r>
+            <w:r>
+              <w:rPr>
+                <w:sz w:val="26"/>
+                <w:szCs w:val="26"/>
+              </w:rPr>
+              <w:t xml:space="preserve"> </w:t>
             </w:r>
             <w:r>
               <w:rPr>
@@ -357,56 +378,65 @@
                 <w:sz w:val="26"/>
                 <w:szCs w:val="26"/>
               </w:rPr>
-              <w:t>fim1</w:t>
-            </w:r>
-            <w:r>
-              <w:rPr>
+              <w:t xml:space="preserve">começo1 a </w:t>
+            </w:r>
+            <w:r>
+              <w:rPr>
+                <w:b/>
+                <w:bCs/>
                 <w:sz w:val="26"/>
                 <w:szCs w:val="26"/>
               </w:rPr>
-              <w:t>,</w:t>
+              <w:t>fim1</w:t>
             </w:r>
             <w:r>
               <w:rPr>
                 <w:sz w:val="26"/>
                 <w:szCs w:val="26"/>
               </w:rPr>
-              <w:t xml:space="preserve"> </w:t>
+              <w:t>,</w:t>
             </w:r>
             <w:r>
               <w:rPr>
                 <w:sz w:val="26"/>
                 <w:szCs w:val="26"/>
               </w:rPr>
-              <w:t>nas dependências da empresa</w:t>
+              <w:t xml:space="preserve"> </w:t>
             </w:r>
             <w:r>
               <w:rPr>
                 <w:sz w:val="26"/>
                 <w:szCs w:val="26"/>
               </w:rPr>
-              <w:t xml:space="preserve"> </w:t>
+              <w:t>nas dependências da empresa</w:t>
             </w:r>
             <w:r>
               <w:rPr>
                 <w:sz w:val="26"/>
                 <w:szCs w:val="26"/>
               </w:rPr>
-              <w:t>empresa1</w:t>
+              <w:t xml:space="preserve"> </w:t>
             </w:r>
             <w:r>
               <w:rPr>
                 <w:sz w:val="26"/>
                 <w:szCs w:val="26"/>
               </w:rPr>
-              <w:t xml:space="preserve">, localizada na </w:t>
+              <w:t>Projetta Engenharia Consultoria e Treinamentos LTDA</w:t>
             </w:r>
             <w:r>
               <w:rPr>
                 <w:sz w:val="26"/>
                 <w:szCs w:val="26"/>
               </w:rPr>
-              <w:t>endereço1.</w:t>
+              <w:t xml:space="preserve">, localizada </w:t>
+            </w:r>
+            <w:r>
+              <w:rPr>
+                <w:sz w:val="26"/>
+                <w:szCs w:val="26"/>
+              </w:rPr>
+              <w:t>Av. Sagrado Coração de Jesus, 550, Jd. Boa Vista, Guariba (SP).</w:t>
             </w:r>
           </w:p>
         </w:tc>
@@ -435,7 +465,14 @@
           <w:sz w:val="26"/>
           <w:szCs w:val="26"/>
         </w:rPr>
-        <w:t>cidade1, fim2.</w:t>
+        <w:t>Guariba (SP)</w:t>
+      </w:r>
+      <w:r>
+        <w:rPr>
+          <w:sz w:val="26"/>
+          <w:szCs w:val="26"/>
+        </w:rPr>
+        <w:t>, fim2.</w:t>
       </w:r>
     </w:p>
     <w:p>
@@ -709,7 +746,7 @@
                       <w:noProof/>
                     </w:rPr>
                     <w:drawing>
-                      <wp:anchor distT="0" distB="0" distL="114300" distR="114300" simplePos="0" relativeHeight="251664384" behindDoc="1" locked="0" layoutInCell="1" allowOverlap="0" wp14:anchorId="0BE18D1C" wp14:editId="66EF2670">
+                      <wp:anchor distT="0" distB="0" distL="114300" distR="114300" simplePos="0" relativeHeight="251664384" behindDoc="1" locked="0" layoutInCell="1" allowOverlap="0" wp14:anchorId="0BE18D1C" wp14:editId="10E4CA2C">
                         <wp:simplePos x="0" y="0"/>
                         <wp:positionH relativeFrom="column">
                           <wp:posOffset>-180975</wp:posOffset>
@@ -1356,14 +1393,7 @@
                 <w:sz w:val="18"/>
                 <w:szCs w:val="18"/>
               </w:rPr>
-              <w:t>logo</w:t>
-            </w:r>
-            <w:r>
-              <w:rPr>
-                <w:sz w:val="18"/>
-                <w:szCs w:val="18"/>
-              </w:rPr>
-              <w:t>2</w:t>
+              <w:t>logo2</w:t>
             </w:r>
           </w:p>
         </w:tc>
@@ -1396,8 +1426,20 @@
                 <w:sz w:val="18"/>
                 <w:szCs w:val="18"/>
               </w:rPr>
-              <w:t>empresa</w:t>
-            </w:r>
+              <w:t>empresa2</w:t>
+            </w:r>
+          </w:p>
+          <w:p>
+            <w:pPr>
+              <w:spacing w:before="20"/>
+              <w:jc w:val="center"/>
+              <w:rPr>
+                <w:i/>
+                <w:iCs/>
+                <w:sz w:val="18"/>
+                <w:szCs w:val="18"/>
+              </w:rPr>
+            </w:pPr>
             <w:r>
               <w:rPr>
                 <w:b/>
@@ -1407,20 +1449,8 @@
                 <w:sz w:val="18"/>
                 <w:szCs w:val="18"/>
               </w:rPr>
-              <w:t>2</w:t>
-            </w:r>
-          </w:p>
-          <w:p>
-            <w:pPr>
-              <w:spacing w:before="20"/>
-              <w:jc w:val="center"/>
-              <w:rPr>
-                <w:i/>
-                <w:iCs/>
-                <w:sz w:val="18"/>
-                <w:szCs w:val="18"/>
-              </w:rPr>
-            </w:pPr>
+              <w:t xml:space="preserve">CNPJ: </w:t>
+            </w:r>
             <w:r>
               <w:rPr>
                 <w:b/>
@@ -1430,29 +1460,7 @@
                 <w:sz w:val="18"/>
                 <w:szCs w:val="18"/>
               </w:rPr>
-              <w:t xml:space="preserve">CNPJ: </w:t>
-            </w:r>
-            <w:r>
-              <w:rPr>
-                <w:b/>
-                <w:bCs/>
-                <w:i/>
-                <w:iCs/>
-                <w:sz w:val="18"/>
-                <w:szCs w:val="18"/>
-              </w:rPr>
-              <w:t>cnpj</w:t>
-            </w:r>
-            <w:r>
-              <w:rPr>
-                <w:b/>
-                <w:bCs/>
-                <w:i/>
-                <w:iCs/>
-                <w:sz w:val="18"/>
-                <w:szCs w:val="18"/>
-              </w:rPr>
-              <w:t>2</w:t>
+              <w:t>cnpj2</w:t>
             </w:r>
           </w:p>
         </w:tc>
@@ -1520,22 +1528,69 @@
           </w:tcPr>
           <w:p>
             <w:pPr>
+              <w:rPr>
+                <w:sz w:val="19"/>
+                <w:szCs w:val="19"/>
+              </w:rPr>
+            </w:pPr>
+            <w:r>
+              <w:rPr>
+                <w:sz w:val="19"/>
+                <w:szCs w:val="19"/>
+              </w:rPr>
+              <w:t>1.</w:t>
+            </w:r>
+            <w:r>
+              <w:rPr>
+                <w:sz w:val="19"/>
+                <w:szCs w:val="19"/>
+              </w:rPr>
+              <w:tab/>
+              <w:t>Introdução à Segurança com Eletricidade</w:t>
+            </w:r>
+          </w:p>
+          <w:p>
+            <w:pPr>
+              <w:rPr>
+                <w:sz w:val="19"/>
+                <w:szCs w:val="19"/>
+              </w:rPr>
+            </w:pPr>
+            <w:r>
+              <w:rPr>
+                <w:sz w:val="19"/>
+                <w:szCs w:val="19"/>
+              </w:rPr>
+              <w:t>2.</w:t>
+            </w:r>
+            <w:r>
+              <w:rPr>
+                <w:sz w:val="19"/>
+                <w:szCs w:val="19"/>
+              </w:rPr>
+              <w:tab/>
+              <w:t>Risco em Instalações e Serviços com Eletricidade:</w:t>
+            </w:r>
+          </w:p>
+          <w:p>
+            <w:pPr>
               <w:pStyle w:val="PargrafodaLista"/>
               <w:numPr>
                 <w:ilvl w:val="0"/>
-                <w:numId w:val="3"/>
+                <w:numId w:val="7"/>
               </w:numPr>
-              <w:rPr>
-                <w:sz w:val="19"/>
-                <w:szCs w:val="19"/>
-              </w:rPr>
-            </w:pPr>
-            <w:r>
-              <w:rPr>
-                <w:sz w:val="19"/>
-                <w:szCs w:val="19"/>
-              </w:rPr>
-              <w:t>Legislação e Apresentação da Norma NR 10;</w:t>
+              <w:ind w:left="714" w:hanging="357"/>
+              <w:rPr>
+                <w:sz w:val="19"/>
+                <w:szCs w:val="19"/>
+              </w:rPr>
+            </w:pPr>
+            <w:r>
+              <w:rPr>
+                <w:sz w:val="19"/>
+                <w:szCs w:val="19"/>
+              </w:rPr>
+              <w:t>Choque elétrico, mecanismo; e efeitos</w:t>
             </w:r>
           </w:p>
           <w:p>
@@ -1543,19 +1598,20 @@
               <w:pStyle w:val="PargrafodaLista"/>
               <w:numPr>
                 <w:ilvl w:val="0"/>
-                <w:numId w:val="3"/>
+                <w:numId w:val="7"/>
               </w:numPr>
-              <w:rPr>
-                <w:sz w:val="19"/>
-                <w:szCs w:val="19"/>
-              </w:rPr>
-            </w:pPr>
-            <w:r>
-              <w:rPr>
-                <w:sz w:val="19"/>
-                <w:szCs w:val="19"/>
-              </w:rPr>
-              <w:t>Introdução à segurança com Eletricidade;</w:t>
+              <w:ind w:left="714" w:hanging="357"/>
+              <w:rPr>
+                <w:sz w:val="19"/>
+                <w:szCs w:val="19"/>
+              </w:rPr>
+            </w:pPr>
+            <w:r>
+              <w:rPr>
+                <w:sz w:val="19"/>
+                <w:szCs w:val="19"/>
+              </w:rPr>
+              <w:t>Arcos elétricos; queimaduras e quedas</w:t>
             </w:r>
           </w:p>
           <w:p>
@@ -1563,19 +1619,80 @@
               <w:pStyle w:val="PargrafodaLista"/>
               <w:numPr>
                 <w:ilvl w:val="0"/>
-                <w:numId w:val="3"/>
+                <w:numId w:val="7"/>
               </w:numPr>
-              <w:rPr>
-                <w:sz w:val="19"/>
-                <w:szCs w:val="19"/>
-              </w:rPr>
-            </w:pPr>
-            <w:r>
-              <w:rPr>
-                <w:sz w:val="19"/>
-                <w:szCs w:val="19"/>
-              </w:rPr>
-              <w:t>Energia Elétrica - Geração, Transmissão e Distribuição;</w:t>
+              <w:ind w:left="714" w:hanging="357"/>
+              <w:rPr>
+                <w:sz w:val="19"/>
+                <w:szCs w:val="19"/>
+              </w:rPr>
+            </w:pPr>
+            <w:r>
+              <w:rPr>
+                <w:sz w:val="19"/>
+                <w:szCs w:val="19"/>
+              </w:rPr>
+              <w:t>Campos eletromagnéticos.</w:t>
+            </w:r>
+          </w:p>
+          <w:p>
+            <w:pPr>
+              <w:rPr>
+                <w:sz w:val="19"/>
+                <w:szCs w:val="19"/>
+              </w:rPr>
+            </w:pPr>
+            <w:r>
+              <w:rPr>
+                <w:sz w:val="19"/>
+                <w:szCs w:val="19"/>
+              </w:rPr>
+              <w:t>3.</w:t>
+            </w:r>
+            <w:r>
+              <w:rPr>
+                <w:sz w:val="19"/>
+                <w:szCs w:val="19"/>
+              </w:rPr>
+              <w:tab/>
+              <w:t>Técnicas de</w:t>
+            </w:r>
+            <w:r>
+              <w:rPr>
+                <w:sz w:val="19"/>
+                <w:szCs w:val="19"/>
+              </w:rPr>
+              <w:t xml:space="preserve"> </w:t>
+            </w:r>
+            <w:r>
+              <w:rPr>
+                <w:sz w:val="19"/>
+                <w:szCs w:val="19"/>
+              </w:rPr>
+              <w:t>Análise de Risco</w:t>
+            </w:r>
+          </w:p>
+          <w:p>
+            <w:pPr>
+              <w:rPr>
+                <w:sz w:val="19"/>
+                <w:szCs w:val="19"/>
+              </w:rPr>
+            </w:pPr>
+            <w:r>
+              <w:rPr>
+                <w:sz w:val="19"/>
+                <w:szCs w:val="19"/>
+              </w:rPr>
+              <w:t>4.</w:t>
+            </w:r>
+            <w:r>
+              <w:rPr>
+                <w:sz w:val="19"/>
+                <w:szCs w:val="19"/>
+              </w:rPr>
+              <w:tab/>
+              <w:t>Medida de Controle de Risco Elétrico</w:t>
             </w:r>
           </w:p>
           <w:p>
@@ -1583,19 +1700,20 @@
               <w:pStyle w:val="PargrafodaLista"/>
               <w:numPr>
                 <w:ilvl w:val="0"/>
-                <w:numId w:val="3"/>
+                <w:numId w:val="9"/>
               </w:numPr>
-              <w:rPr>
-                <w:sz w:val="19"/>
-                <w:szCs w:val="19"/>
-              </w:rPr>
-            </w:pPr>
-            <w:r>
-              <w:rPr>
-                <w:sz w:val="19"/>
-                <w:szCs w:val="19"/>
-              </w:rPr>
-              <w:t>Atividades de Manutenção e Inspeção na Geração, Transmissão e Distribuição;</w:t>
+              <w:ind w:left="714" w:hanging="357"/>
+              <w:rPr>
+                <w:sz w:val="19"/>
+                <w:szCs w:val="19"/>
+              </w:rPr>
+            </w:pPr>
+            <w:r>
+              <w:rPr>
+                <w:sz w:val="19"/>
+                <w:szCs w:val="19"/>
+              </w:rPr>
+              <w:t>Desenergização</w:t>
             </w:r>
           </w:p>
           <w:p>
@@ -1603,19 +1721,20 @@
               <w:pStyle w:val="PargrafodaLista"/>
               <w:numPr>
                 <w:ilvl w:val="0"/>
-                <w:numId w:val="3"/>
+                <w:numId w:val="9"/>
               </w:numPr>
-              <w:rPr>
-                <w:sz w:val="19"/>
-                <w:szCs w:val="19"/>
-              </w:rPr>
-            </w:pPr>
-            <w:r>
-              <w:rPr>
-                <w:sz w:val="19"/>
-                <w:szCs w:val="19"/>
-              </w:rPr>
-              <w:t>Riscos em Instalações e Serviços com Eletricidade;</w:t>
+              <w:ind w:left="714" w:hanging="357"/>
+              <w:rPr>
+                <w:sz w:val="19"/>
+                <w:szCs w:val="19"/>
+              </w:rPr>
+            </w:pPr>
+            <w:r>
+              <w:rPr>
+                <w:sz w:val="19"/>
+                <w:szCs w:val="19"/>
+              </w:rPr>
+              <w:t>Aterramento funcional (TN/TT/IT) de proteção temporário</w:t>
             </w:r>
           </w:p>
           <w:p>
@@ -1623,19 +1742,20 @@
               <w:pStyle w:val="PargrafodaLista"/>
               <w:numPr>
                 <w:ilvl w:val="0"/>
-                <w:numId w:val="3"/>
+                <w:numId w:val="9"/>
               </w:numPr>
-              <w:rPr>
-                <w:sz w:val="19"/>
-                <w:szCs w:val="19"/>
-              </w:rPr>
-            </w:pPr>
-            <w:r>
-              <w:rPr>
-                <w:sz w:val="19"/>
-                <w:szCs w:val="19"/>
-              </w:rPr>
-              <w:t>Técnicas de Análise de Risco;</w:t>
+              <w:ind w:left="714" w:hanging="357"/>
+              <w:rPr>
+                <w:sz w:val="19"/>
+                <w:szCs w:val="19"/>
+              </w:rPr>
+            </w:pPr>
+            <w:r>
+              <w:rPr>
+                <w:sz w:val="19"/>
+                <w:szCs w:val="19"/>
+              </w:rPr>
+              <w:t>Equipotencialização</w:t>
             </w:r>
           </w:p>
           <w:p>
@@ -1643,19 +1763,20 @@
               <w:pStyle w:val="PargrafodaLista"/>
               <w:numPr>
                 <w:ilvl w:val="0"/>
-                <w:numId w:val="3"/>
+                <w:numId w:val="9"/>
               </w:numPr>
-              <w:rPr>
-                <w:sz w:val="19"/>
-                <w:szCs w:val="19"/>
-              </w:rPr>
-            </w:pPr>
-            <w:r>
-              <w:rPr>
-                <w:sz w:val="19"/>
-                <w:szCs w:val="19"/>
-              </w:rPr>
-              <w:t>Medidas de Controle do Risco Elétrico – MCRE;</w:t>
+              <w:ind w:left="714" w:hanging="357"/>
+              <w:rPr>
+                <w:sz w:val="19"/>
+                <w:szCs w:val="19"/>
+              </w:rPr>
+            </w:pPr>
+            <w:r>
+              <w:rPr>
+                <w:sz w:val="19"/>
+                <w:szCs w:val="19"/>
+              </w:rPr>
+              <w:t>Seccionamento automático da alimentação</w:t>
             </w:r>
           </w:p>
           <w:p>
@@ -1663,19 +1784,20 @@
               <w:pStyle w:val="PargrafodaLista"/>
               <w:numPr>
                 <w:ilvl w:val="0"/>
-                <w:numId w:val="3"/>
+                <w:numId w:val="9"/>
               </w:numPr>
-              <w:rPr>
-                <w:sz w:val="19"/>
-                <w:szCs w:val="19"/>
-              </w:rPr>
-            </w:pPr>
-            <w:r>
-              <w:rPr>
-                <w:sz w:val="19"/>
-                <w:szCs w:val="19"/>
-              </w:rPr>
-              <w:t>Equipamentos de Proteção Coletiva e Individual (EPC/EPI);</w:t>
+              <w:ind w:left="714" w:hanging="357"/>
+              <w:rPr>
+                <w:sz w:val="19"/>
+                <w:szCs w:val="19"/>
+              </w:rPr>
+            </w:pPr>
+            <w:r>
+              <w:rPr>
+                <w:sz w:val="19"/>
+                <w:szCs w:val="19"/>
+              </w:rPr>
+              <w:t>Dispositivo a corrente de fuga</w:t>
             </w:r>
           </w:p>
           <w:p>
@@ -1683,19 +1805,20 @@
               <w:pStyle w:val="PargrafodaLista"/>
               <w:numPr>
                 <w:ilvl w:val="0"/>
-                <w:numId w:val="3"/>
+                <w:numId w:val="9"/>
               </w:numPr>
-              <w:rPr>
-                <w:sz w:val="19"/>
-                <w:szCs w:val="19"/>
-              </w:rPr>
-            </w:pPr>
-            <w:r>
-              <w:rPr>
-                <w:sz w:val="19"/>
-                <w:szCs w:val="19"/>
-              </w:rPr>
-              <w:t>Rotinas de Trabalho – Procedimentos;</w:t>
+              <w:ind w:left="714" w:hanging="357"/>
+              <w:rPr>
+                <w:sz w:val="19"/>
+                <w:szCs w:val="19"/>
+              </w:rPr>
+            </w:pPr>
+            <w:r>
+              <w:rPr>
+                <w:sz w:val="19"/>
+                <w:szCs w:val="19"/>
+              </w:rPr>
+              <w:t>Extra baixa tensão</w:t>
             </w:r>
           </w:p>
           <w:p>
@@ -1703,19 +1826,20 @@
               <w:pStyle w:val="PargrafodaLista"/>
               <w:numPr>
                 <w:ilvl w:val="0"/>
-                <w:numId w:val="3"/>
+                <w:numId w:val="9"/>
               </w:numPr>
-              <w:rPr>
-                <w:sz w:val="19"/>
-                <w:szCs w:val="19"/>
-              </w:rPr>
-            </w:pPr>
-            <w:r>
-              <w:rPr>
-                <w:sz w:val="19"/>
-                <w:szCs w:val="19"/>
-              </w:rPr>
-              <w:t>Documentação de Instalações Elétricas;</w:t>
+              <w:ind w:left="714" w:hanging="357"/>
+              <w:rPr>
+                <w:sz w:val="19"/>
+                <w:szCs w:val="19"/>
+              </w:rPr>
+            </w:pPr>
+            <w:r>
+              <w:rPr>
+                <w:sz w:val="19"/>
+                <w:szCs w:val="19"/>
+              </w:rPr>
+              <w:t>Barreiras invólucros</w:t>
             </w:r>
           </w:p>
           <w:p>
@@ -1723,19 +1847,20 @@
               <w:pStyle w:val="PargrafodaLista"/>
               <w:numPr>
                 <w:ilvl w:val="0"/>
-                <w:numId w:val="3"/>
+                <w:numId w:val="9"/>
               </w:numPr>
-              <w:rPr>
-                <w:sz w:val="19"/>
-                <w:szCs w:val="19"/>
-              </w:rPr>
-            </w:pPr>
-            <w:r>
-              <w:rPr>
-                <w:sz w:val="19"/>
-                <w:szCs w:val="19"/>
-              </w:rPr>
-              <w:t>Proteção e Combate a Incêndio;</w:t>
+              <w:ind w:left="714" w:hanging="357"/>
+              <w:rPr>
+                <w:sz w:val="19"/>
+                <w:szCs w:val="19"/>
+              </w:rPr>
+            </w:pPr>
+            <w:r>
+              <w:rPr>
+                <w:sz w:val="19"/>
+                <w:szCs w:val="19"/>
+              </w:rPr>
+              <w:t>Bloqueios e impedimentos</w:t>
             </w:r>
           </w:p>
           <w:p>
@@ -1743,19 +1868,20 @@
               <w:pStyle w:val="PargrafodaLista"/>
               <w:numPr>
                 <w:ilvl w:val="0"/>
-                <w:numId w:val="3"/>
+                <w:numId w:val="9"/>
               </w:numPr>
-              <w:rPr>
-                <w:sz w:val="19"/>
-                <w:szCs w:val="19"/>
-              </w:rPr>
-            </w:pPr>
-            <w:r>
-              <w:rPr>
-                <w:sz w:val="19"/>
-                <w:szCs w:val="19"/>
-              </w:rPr>
-              <w:t>Tipos de Choques Elétricos;</w:t>
+              <w:ind w:left="714" w:hanging="357"/>
+              <w:rPr>
+                <w:sz w:val="19"/>
+                <w:szCs w:val="19"/>
+              </w:rPr>
+            </w:pPr>
+            <w:r>
+              <w:rPr>
+                <w:sz w:val="19"/>
+                <w:szCs w:val="19"/>
+              </w:rPr>
+              <w:t>Obstáculos e anteparos</w:t>
             </w:r>
           </w:p>
           <w:p>
@@ -1763,19 +1889,20 @@
               <w:pStyle w:val="PargrafodaLista"/>
               <w:numPr>
                 <w:ilvl w:val="0"/>
-                <w:numId w:val="3"/>
+                <w:numId w:val="9"/>
               </w:numPr>
-              <w:rPr>
-                <w:sz w:val="19"/>
-                <w:szCs w:val="19"/>
-              </w:rPr>
-            </w:pPr>
-            <w:r>
-              <w:rPr>
-                <w:sz w:val="19"/>
-                <w:szCs w:val="19"/>
-              </w:rPr>
-              <w:t>Efeitos do Choque Elétrico – Queimaduras e Contrações Musculares;</w:t>
+              <w:ind w:left="714" w:hanging="357"/>
+              <w:rPr>
+                <w:sz w:val="19"/>
+                <w:szCs w:val="19"/>
+              </w:rPr>
+            </w:pPr>
+            <w:r>
+              <w:rPr>
+                <w:sz w:val="19"/>
+                <w:szCs w:val="19"/>
+              </w:rPr>
+              <w:t>Isolamento das partes vivas</w:t>
             </w:r>
           </w:p>
           <w:p>
@@ -1783,19 +1910,20 @@
               <w:pStyle w:val="PargrafodaLista"/>
               <w:numPr>
                 <w:ilvl w:val="0"/>
-                <w:numId w:val="3"/>
+                <w:numId w:val="9"/>
               </w:numPr>
-              <w:rPr>
-                <w:sz w:val="19"/>
-                <w:szCs w:val="19"/>
-              </w:rPr>
-            </w:pPr>
-            <w:r>
-              <w:rPr>
-                <w:sz w:val="19"/>
-                <w:szCs w:val="19"/>
-              </w:rPr>
-              <w:t>Causas Determinantes de Choques Elétricos;</w:t>
+              <w:ind w:left="714" w:hanging="357"/>
+              <w:rPr>
+                <w:sz w:val="19"/>
+                <w:szCs w:val="19"/>
+              </w:rPr>
+            </w:pPr>
+            <w:r>
+              <w:rPr>
+                <w:sz w:val="19"/>
+                <w:szCs w:val="19"/>
+              </w:rPr>
+              <w:t>Isolação dupla ou reforçada</w:t>
             </w:r>
           </w:p>
           <w:p>
@@ -1803,33 +1931,20 @@
               <w:pStyle w:val="PargrafodaLista"/>
               <w:numPr>
                 <w:ilvl w:val="0"/>
-                <w:numId w:val="3"/>
+                <w:numId w:val="9"/>
               </w:numPr>
-              <w:rPr>
-                <w:sz w:val="19"/>
-                <w:szCs w:val="19"/>
-              </w:rPr>
-            </w:pPr>
-            <w:r>
-              <w:rPr>
-                <w:sz w:val="19"/>
-                <w:szCs w:val="19"/>
-              </w:rPr>
-              <w:t>Os Perigos do Arco Elétrico</w:t>
-            </w:r>
-            <w:r>
-              <w:rPr>
-                <w:sz w:val="19"/>
-                <w:szCs w:val="19"/>
-              </w:rPr>
-              <w:t xml:space="preserve">. </w:t>
-            </w:r>
-            <w:r>
-              <w:rPr>
-                <w:sz w:val="19"/>
-                <w:szCs w:val="19"/>
-              </w:rPr>
-              <w:t>Outros Perigos e Riscos de Ambiente;</w:t>
+              <w:ind w:left="714" w:hanging="357"/>
+              <w:rPr>
+                <w:sz w:val="19"/>
+                <w:szCs w:val="19"/>
+              </w:rPr>
+            </w:pPr>
+            <w:r>
+              <w:rPr>
+                <w:sz w:val="19"/>
+                <w:szCs w:val="19"/>
+              </w:rPr>
+              <w:t>Colocação fora de alcance</w:t>
             </w:r>
           </w:p>
           <w:p>
@@ -1837,19 +1952,82 @@
               <w:pStyle w:val="PargrafodaLista"/>
               <w:numPr>
                 <w:ilvl w:val="0"/>
-                <w:numId w:val="3"/>
+                <w:numId w:val="9"/>
               </w:numPr>
-              <w:rPr>
-                <w:sz w:val="19"/>
-                <w:szCs w:val="19"/>
-              </w:rPr>
-            </w:pPr>
-            <w:r>
-              <w:rPr>
-                <w:sz w:val="19"/>
-                <w:szCs w:val="19"/>
-              </w:rPr>
-              <w:t>Campos Eletromagnéticos;</w:t>
+              <w:ind w:left="714" w:hanging="357"/>
+              <w:rPr>
+                <w:sz w:val="19"/>
+                <w:szCs w:val="19"/>
+              </w:rPr>
+            </w:pPr>
+            <w:r>
+              <w:rPr>
+                <w:sz w:val="19"/>
+                <w:szCs w:val="19"/>
+              </w:rPr>
+              <w:t>Separação elétrica</w:t>
+            </w:r>
+          </w:p>
+          <w:p>
+            <w:pPr>
+              <w:rPr>
+                <w:sz w:val="19"/>
+                <w:szCs w:val="19"/>
+              </w:rPr>
+            </w:pPr>
+            <w:r>
+              <w:rPr>
+                <w:sz w:val="19"/>
+                <w:szCs w:val="19"/>
+              </w:rPr>
+              <w:t>5.</w:t>
+            </w:r>
+            <w:r>
+              <w:rPr>
+                <w:sz w:val="19"/>
+                <w:szCs w:val="19"/>
+              </w:rPr>
+              <w:tab/>
+              <w:t>Normas Técnicas Brasileiras – NBR da ABNT: NBR 5410</w:t>
+            </w:r>
+          </w:p>
+          <w:p>
+            <w:pPr>
+              <w:ind w:left="360"/>
+              <w:rPr>
+                <w:sz w:val="19"/>
+                <w:szCs w:val="19"/>
+              </w:rPr>
+            </w:pPr>
+            <w:r>
+              <w:rPr>
+                <w:sz w:val="19"/>
+                <w:szCs w:val="19"/>
+              </w:rPr>
+              <w:t>NBR 14039 e outras</w:t>
+            </w:r>
+          </w:p>
+          <w:p>
+            <w:pPr>
+              <w:rPr>
+                <w:sz w:val="19"/>
+                <w:szCs w:val="19"/>
+              </w:rPr>
+            </w:pPr>
+            <w:r>
+              <w:rPr>
+                <w:sz w:val="19"/>
+                <w:szCs w:val="19"/>
+              </w:rPr>
+              <w:t>6.</w:t>
+            </w:r>
+            <w:r>
+              <w:rPr>
+                <w:sz w:val="19"/>
+                <w:szCs w:val="19"/>
+              </w:rPr>
+              <w:tab/>
+              <w:t>Regulamentações do MTE:</w:t>
             </w:r>
           </w:p>
           <w:p>
@@ -1857,39 +2035,43 @@
               <w:pStyle w:val="PargrafodaLista"/>
               <w:numPr>
                 <w:ilvl w:val="0"/>
-                <w:numId w:val="3"/>
+                <w:numId w:val="12"/>
               </w:numPr>
-              <w:rPr>
-                <w:sz w:val="19"/>
-                <w:szCs w:val="19"/>
-              </w:rPr>
-            </w:pPr>
-            <w:r>
-              <w:rPr>
-                <w:sz w:val="19"/>
-                <w:szCs w:val="19"/>
-              </w:rPr>
-              <w:t>MCRE – Desenergização; Aterramento Funcional, de Proteção e Temporário (TN /TT / IT); Equipotencialização; Seccionamento Automático da Alimentação; Dispositivo de proteção a corrente diferencial-residual – DR; Proteção por Extrabaixa Tensão: SELV E PELV; Barreiras e Invólucros; Bloqueios e Impedimentos; Isolamento; Proteção por Colocação Fora de Alcance e Separação Elétrica;</w:t>
-            </w:r>
+              <w:ind w:left="714" w:hanging="357"/>
+              <w:rPr>
+                <w:sz w:val="19"/>
+                <w:szCs w:val="19"/>
+              </w:rPr>
+            </w:pPr>
+            <w:proofErr w:type="spellStart"/>
+            <w:r>
+              <w:rPr>
+                <w:sz w:val="19"/>
+                <w:szCs w:val="19"/>
+              </w:rPr>
+              <w:t>NR’s</w:t>
+            </w:r>
+            <w:proofErr w:type="spellEnd"/>
           </w:p>
           <w:p>
             <w:pPr>
               <w:pStyle w:val="PargrafodaLista"/>
               <w:numPr>
                 <w:ilvl w:val="0"/>
-                <w:numId w:val="3"/>
+                <w:numId w:val="10"/>
               </w:numPr>
-              <w:rPr>
-                <w:sz w:val="19"/>
-                <w:szCs w:val="19"/>
-              </w:rPr>
-            </w:pPr>
-            <w:r>
-              <w:rPr>
-                <w:sz w:val="19"/>
-                <w:szCs w:val="19"/>
-              </w:rPr>
-              <w:t>Acidentes de Origem Elétrica e Primeiros Socorros em Caso de Acidente com Eletricidade;</w:t>
+              <w:ind w:left="714" w:hanging="357"/>
+              <w:rPr>
+                <w:sz w:val="19"/>
+                <w:szCs w:val="19"/>
+              </w:rPr>
+            </w:pPr>
+            <w:r>
+              <w:rPr>
+                <w:sz w:val="19"/>
+                <w:szCs w:val="19"/>
+              </w:rPr>
+              <w:t>NR-10 (Segurança em Instalações e Serviços com Eletricidade)</w:t>
             </w:r>
           </w:p>
           <w:p>
@@ -1897,79 +2079,66 @@
               <w:pStyle w:val="PargrafodaLista"/>
               <w:numPr>
                 <w:ilvl w:val="0"/>
-                <w:numId w:val="3"/>
+                <w:numId w:val="10"/>
               </w:numPr>
-              <w:rPr>
-                <w:sz w:val="19"/>
-                <w:szCs w:val="19"/>
-              </w:rPr>
-            </w:pPr>
-            <w:r>
-              <w:rPr>
-                <w:sz w:val="19"/>
-                <w:szCs w:val="19"/>
-              </w:rPr>
-              <w:t>Responsabilidades;</w:t>
-            </w:r>
-          </w:p>
-          <w:p>
-            <w:pPr>
-              <w:pStyle w:val="PargrafodaLista"/>
-              <w:numPr>
-                <w:ilvl w:val="0"/>
-                <w:numId w:val="3"/>
-              </w:numPr>
-              <w:rPr>
-                <w:sz w:val="19"/>
-                <w:szCs w:val="19"/>
-              </w:rPr>
-            </w:pPr>
-            <w:r>
-              <w:rPr>
-                <w:sz w:val="19"/>
-                <w:szCs w:val="19"/>
-              </w:rPr>
-              <w:t>Converter unidades de medidas realizando operações fundamentais para a medição de elementos mecânicos</w:t>
-            </w:r>
-          </w:p>
-          <w:p>
-            <w:pPr>
-              <w:pStyle w:val="PargrafodaLista"/>
-              <w:numPr>
-                <w:ilvl w:val="0"/>
-                <w:numId w:val="3"/>
-              </w:numPr>
-              <w:rPr>
-                <w:sz w:val="19"/>
-                <w:szCs w:val="19"/>
-              </w:rPr>
-            </w:pPr>
-            <w:r>
-              <w:rPr>
-                <w:sz w:val="19"/>
-                <w:szCs w:val="19"/>
-              </w:rPr>
-              <w:t>Efetuar medições com os instrumentos identificando as grandezas físicas;</w:t>
-            </w:r>
-          </w:p>
-          <w:p>
-            <w:pPr>
-              <w:pStyle w:val="PargrafodaLista"/>
-              <w:numPr>
-                <w:ilvl w:val="0"/>
-                <w:numId w:val="3"/>
-              </w:numPr>
-              <w:rPr>
-                <w:sz w:val="19"/>
-                <w:szCs w:val="19"/>
-              </w:rPr>
-            </w:pPr>
-            <w:r>
-              <w:rPr>
-                <w:sz w:val="19"/>
-                <w:szCs w:val="19"/>
-              </w:rPr>
-              <w:t>Interpretar o plano de manutenção periódica conforme orientações da montadora;</w:t>
+              <w:ind w:left="714" w:hanging="357"/>
+              <w:rPr>
+                <w:sz w:val="19"/>
+                <w:szCs w:val="19"/>
+              </w:rPr>
+            </w:pPr>
+            <w:r>
+              <w:rPr>
+                <w:sz w:val="19"/>
+                <w:szCs w:val="19"/>
+              </w:rPr>
+              <w:t>Qualificação; Habilitação; Capacitação e autorização.</w:t>
+            </w:r>
+          </w:p>
+          <w:p>
+            <w:pPr>
+              <w:rPr>
+                <w:sz w:val="19"/>
+                <w:szCs w:val="19"/>
+              </w:rPr>
+            </w:pPr>
+            <w:r>
+              <w:rPr>
+                <w:sz w:val="19"/>
+                <w:szCs w:val="19"/>
+              </w:rPr>
+              <w:t>7.</w:t>
+            </w:r>
+            <w:r>
+              <w:rPr>
+                <w:sz w:val="19"/>
+                <w:szCs w:val="19"/>
+              </w:rPr>
+              <w:tab/>
+              <w:t>Equipamentos de Proteção Coletiva</w:t>
+            </w:r>
+          </w:p>
+          <w:p>
+            <w:pPr>
+              <w:rPr>
+                <w:sz w:val="19"/>
+                <w:szCs w:val="19"/>
+              </w:rPr>
+            </w:pPr>
+            <w:r>
+              <w:rPr>
+                <w:sz w:val="19"/>
+                <w:szCs w:val="19"/>
+              </w:rPr>
+              <w:t>8.</w:t>
+            </w:r>
+            <w:r>
+              <w:rPr>
+                <w:sz w:val="19"/>
+                <w:szCs w:val="19"/>
+              </w:rPr>
+              <w:tab/>
+              <w:t>Equipamentos de Proteção Individual</w:t>
             </w:r>
           </w:p>
         </w:tc>
@@ -1979,22 +2148,46 @@
           </w:tcPr>
           <w:p>
             <w:pPr>
+              <w:rPr>
+                <w:sz w:val="19"/>
+                <w:szCs w:val="19"/>
+              </w:rPr>
+            </w:pPr>
+            <w:r>
+              <w:rPr>
+                <w:sz w:val="19"/>
+                <w:szCs w:val="19"/>
+              </w:rPr>
+              <w:t>9.</w:t>
+            </w:r>
+            <w:r>
+              <w:rPr>
+                <w:sz w:val="19"/>
+                <w:szCs w:val="19"/>
+              </w:rPr>
+              <w:tab/>
+              <w:t>Rotinas de Trabalho - Procedimentos</w:t>
+            </w:r>
+          </w:p>
+          <w:p>
+            <w:pPr>
               <w:pStyle w:val="PargrafodaLista"/>
               <w:numPr>
                 <w:ilvl w:val="0"/>
-                <w:numId w:val="3"/>
+                <w:numId w:val="11"/>
               </w:numPr>
-              <w:rPr>
-                <w:sz w:val="19"/>
-                <w:szCs w:val="19"/>
-              </w:rPr>
-            </w:pPr>
-            <w:r>
-              <w:rPr>
-                <w:sz w:val="19"/>
-                <w:szCs w:val="19"/>
-              </w:rPr>
-              <w:t>Interpretar ordem de serviço para realização da manutenção;</w:t>
+              <w:ind w:left="714" w:hanging="357"/>
+              <w:rPr>
+                <w:sz w:val="19"/>
+                <w:szCs w:val="19"/>
+              </w:rPr>
+            </w:pPr>
+            <w:r>
+              <w:rPr>
+                <w:sz w:val="19"/>
+                <w:szCs w:val="19"/>
+              </w:rPr>
+              <w:t>Instalações desenergizadas</w:t>
             </w:r>
           </w:p>
           <w:p>
@@ -2002,19 +2195,20 @@
               <w:pStyle w:val="PargrafodaLista"/>
               <w:numPr>
                 <w:ilvl w:val="0"/>
-                <w:numId w:val="3"/>
+                <w:numId w:val="11"/>
               </w:numPr>
-              <w:rPr>
-                <w:sz w:val="19"/>
-                <w:szCs w:val="19"/>
-              </w:rPr>
-            </w:pPr>
-            <w:r>
-              <w:rPr>
-                <w:sz w:val="19"/>
-                <w:szCs w:val="19"/>
-              </w:rPr>
-              <w:t>Preencher checklist de recebimento e entrega do veículo;</w:t>
+              <w:ind w:left="714" w:hanging="357"/>
+              <w:rPr>
+                <w:sz w:val="19"/>
+                <w:szCs w:val="19"/>
+              </w:rPr>
+            </w:pPr>
+            <w:r>
+              <w:rPr>
+                <w:sz w:val="19"/>
+                <w:szCs w:val="19"/>
+              </w:rPr>
+              <w:t>Liberação para serviços</w:t>
             </w:r>
           </w:p>
           <w:p>
@@ -2022,19 +2216,82 @@
               <w:pStyle w:val="PargrafodaLista"/>
               <w:numPr>
                 <w:ilvl w:val="0"/>
-                <w:numId w:val="3"/>
+                <w:numId w:val="11"/>
               </w:numPr>
-              <w:rPr>
-                <w:sz w:val="19"/>
-                <w:szCs w:val="19"/>
-              </w:rPr>
-            </w:pPr>
-            <w:r>
-              <w:rPr>
-                <w:sz w:val="19"/>
-                <w:szCs w:val="19"/>
-              </w:rPr>
-              <w:t>Interpretar o manual de reparação quanto ao uso das ferramentas, equipamentos e procedimentos considerando os tipos de manutenção dos sistemas automotivos;</w:t>
+              <w:ind w:left="714" w:hanging="357"/>
+              <w:rPr>
+                <w:sz w:val="19"/>
+                <w:szCs w:val="19"/>
+              </w:rPr>
+            </w:pPr>
+            <w:r>
+              <w:rPr>
+                <w:sz w:val="19"/>
+                <w:szCs w:val="19"/>
+              </w:rPr>
+              <w:t>Sinalização</w:t>
+            </w:r>
+          </w:p>
+          <w:p>
+            <w:pPr>
+              <w:ind w:left="360"/>
+              <w:rPr>
+                <w:sz w:val="19"/>
+                <w:szCs w:val="19"/>
+              </w:rPr>
+            </w:pPr>
+            <w:r>
+              <w:rPr>
+                <w:sz w:val="19"/>
+                <w:szCs w:val="19"/>
+              </w:rPr>
+              <w:t>d)Inspeções diária, serviços, ferramental e equipamentos</w:t>
+            </w:r>
+          </w:p>
+          <w:p>
+            <w:pPr>
+              <w:rPr>
+                <w:sz w:val="19"/>
+                <w:szCs w:val="19"/>
+              </w:rPr>
+            </w:pPr>
+            <w:r>
+              <w:rPr>
+                <w:sz w:val="19"/>
+                <w:szCs w:val="19"/>
+              </w:rPr>
+              <w:t>10.</w:t>
+            </w:r>
+            <w:r>
+              <w:rPr>
+                <w:sz w:val="19"/>
+                <w:szCs w:val="19"/>
+              </w:rPr>
+              <w:tab/>
+              <w:t>Documentação de Instalações Elétricas</w:t>
+            </w:r>
+          </w:p>
+          <w:p>
+            <w:pPr>
+              <w:rPr>
+                <w:sz w:val="19"/>
+                <w:szCs w:val="19"/>
+              </w:rPr>
+            </w:pPr>
+            <w:r>
+              <w:rPr>
+                <w:sz w:val="19"/>
+                <w:szCs w:val="19"/>
+              </w:rPr>
+              <w:t>11.</w:t>
+            </w:r>
+            <w:r>
+              <w:rPr>
+                <w:sz w:val="19"/>
+                <w:szCs w:val="19"/>
+              </w:rPr>
+              <w:tab/>
+              <w:t>Riscos Adicionais</w:t>
             </w:r>
           </w:p>
           <w:p>
@@ -2042,19 +2299,20 @@
               <w:pStyle w:val="PargrafodaLista"/>
               <w:numPr>
                 <w:ilvl w:val="0"/>
-                <w:numId w:val="3"/>
+                <w:numId w:val="13"/>
               </w:numPr>
-              <w:rPr>
-                <w:sz w:val="19"/>
-                <w:szCs w:val="19"/>
-              </w:rPr>
-            </w:pPr>
-            <w:r>
-              <w:rPr>
-                <w:sz w:val="19"/>
-                <w:szCs w:val="19"/>
-              </w:rPr>
-              <w:t>Identificar as características dos elementos de máquinas utilizados na área automotiva;</w:t>
+              <w:ind w:left="714" w:hanging="357"/>
+              <w:rPr>
+                <w:sz w:val="19"/>
+                <w:szCs w:val="19"/>
+              </w:rPr>
+            </w:pPr>
+            <w:r>
+              <w:rPr>
+                <w:sz w:val="19"/>
+                <w:szCs w:val="19"/>
+              </w:rPr>
+              <w:t>Altura</w:t>
             </w:r>
           </w:p>
           <w:p>
@@ -2062,19 +2320,20 @@
               <w:pStyle w:val="PargrafodaLista"/>
               <w:numPr>
                 <w:ilvl w:val="0"/>
-                <w:numId w:val="3"/>
+                <w:numId w:val="13"/>
               </w:numPr>
-              <w:rPr>
-                <w:sz w:val="19"/>
-                <w:szCs w:val="19"/>
-              </w:rPr>
-            </w:pPr>
-            <w:r>
-              <w:rPr>
-                <w:sz w:val="19"/>
-                <w:szCs w:val="19"/>
-              </w:rPr>
-              <w:t>Identificar os princípios da eletricidade aplicáveis ao sistema elétrico automotivo;</w:t>
+              <w:ind w:left="714" w:hanging="357"/>
+              <w:rPr>
+                <w:sz w:val="19"/>
+                <w:szCs w:val="19"/>
+              </w:rPr>
+            </w:pPr>
+            <w:r>
+              <w:rPr>
+                <w:sz w:val="19"/>
+                <w:szCs w:val="19"/>
+              </w:rPr>
+              <w:t>Ambientes confinados</w:t>
             </w:r>
           </w:p>
           <w:p>
@@ -2082,19 +2341,20 @@
               <w:pStyle w:val="PargrafodaLista"/>
               <w:numPr>
                 <w:ilvl w:val="0"/>
-                <w:numId w:val="3"/>
+                <w:numId w:val="13"/>
               </w:numPr>
-              <w:rPr>
-                <w:sz w:val="19"/>
-                <w:szCs w:val="19"/>
-              </w:rPr>
-            </w:pPr>
-            <w:r>
-              <w:rPr>
-                <w:sz w:val="19"/>
-                <w:szCs w:val="19"/>
-              </w:rPr>
-              <w:t>Identificar componentes elétricos aplicáveis ao sistema elétrico automotivo;</w:t>
+              <w:ind w:left="714" w:hanging="357"/>
+              <w:rPr>
+                <w:sz w:val="19"/>
+                <w:szCs w:val="19"/>
+              </w:rPr>
+            </w:pPr>
+            <w:r>
+              <w:rPr>
+                <w:sz w:val="19"/>
+                <w:szCs w:val="19"/>
+              </w:rPr>
+              <w:t>Áreas classificadas</w:t>
             </w:r>
           </w:p>
           <w:p>
@@ -2102,19 +2362,20 @@
               <w:pStyle w:val="PargrafodaLista"/>
               <w:numPr>
                 <w:ilvl w:val="0"/>
-                <w:numId w:val="3"/>
+                <w:numId w:val="13"/>
               </w:numPr>
-              <w:rPr>
-                <w:sz w:val="19"/>
-                <w:szCs w:val="19"/>
-              </w:rPr>
-            </w:pPr>
-            <w:r>
-              <w:rPr>
-                <w:sz w:val="19"/>
-                <w:szCs w:val="19"/>
-              </w:rPr>
-              <w:t>Interpretar esquemas elétricos automotivos;</w:t>
+              <w:ind w:left="714" w:hanging="357"/>
+              <w:rPr>
+                <w:sz w:val="19"/>
+                <w:szCs w:val="19"/>
+              </w:rPr>
+            </w:pPr>
+            <w:r>
+              <w:rPr>
+                <w:sz w:val="19"/>
+                <w:szCs w:val="19"/>
+              </w:rPr>
+              <w:t>Unidades</w:t>
             </w:r>
           </w:p>
           <w:p>
@@ -2122,19 +2383,43 @@
               <w:pStyle w:val="PargrafodaLista"/>
               <w:numPr>
                 <w:ilvl w:val="0"/>
-                <w:numId w:val="3"/>
+                <w:numId w:val="13"/>
               </w:numPr>
-              <w:rPr>
-                <w:sz w:val="19"/>
-                <w:szCs w:val="19"/>
-              </w:rPr>
-            </w:pPr>
-            <w:r>
-              <w:rPr>
-                <w:sz w:val="19"/>
-                <w:szCs w:val="19"/>
-              </w:rPr>
-              <w:t>Medir grandezas elétricas utilizando o multímetro em circuitos elétricos automotivos, considerando: Tensão, Corrente e Resistência;</w:t>
+              <w:ind w:left="714" w:hanging="357"/>
+              <w:rPr>
+                <w:sz w:val="19"/>
+                <w:szCs w:val="19"/>
+              </w:rPr>
+            </w:pPr>
+            <w:r>
+              <w:rPr>
+                <w:sz w:val="19"/>
+                <w:szCs w:val="19"/>
+              </w:rPr>
+              <w:t>Condições atmosféricas</w:t>
+            </w:r>
+          </w:p>
+          <w:p>
+            <w:pPr>
+              <w:rPr>
+                <w:sz w:val="19"/>
+                <w:szCs w:val="19"/>
+              </w:rPr>
+            </w:pPr>
+            <w:r>
+              <w:rPr>
+                <w:sz w:val="19"/>
+                <w:szCs w:val="19"/>
+              </w:rPr>
+              <w:t>12.</w:t>
+            </w:r>
+            <w:r>
+              <w:rPr>
+                <w:sz w:val="19"/>
+                <w:szCs w:val="19"/>
+              </w:rPr>
+              <w:tab/>
+              <w:t>Proteção e Combate a Incêndios</w:t>
             </w:r>
           </w:p>
           <w:p>
@@ -2142,19 +2427,20 @@
               <w:pStyle w:val="PargrafodaLista"/>
               <w:numPr>
                 <w:ilvl w:val="0"/>
-                <w:numId w:val="3"/>
+                <w:numId w:val="14"/>
               </w:numPr>
-              <w:rPr>
-                <w:sz w:val="19"/>
-                <w:szCs w:val="19"/>
-              </w:rPr>
-            </w:pPr>
-            <w:r>
-              <w:rPr>
-                <w:sz w:val="19"/>
-                <w:szCs w:val="19"/>
-              </w:rPr>
-              <w:t>Identificar os princípios de funcionamento dos sistemas de carga e partida;</w:t>
+              <w:ind w:left="714" w:hanging="357"/>
+              <w:rPr>
+                <w:sz w:val="19"/>
+                <w:szCs w:val="19"/>
+              </w:rPr>
+            </w:pPr>
+            <w:r>
+              <w:rPr>
+                <w:sz w:val="19"/>
+                <w:szCs w:val="19"/>
+              </w:rPr>
+              <w:t>Noções básicas</w:t>
             </w:r>
           </w:p>
           <w:p>
@@ -2162,19 +2448,20 @@
               <w:pStyle w:val="PargrafodaLista"/>
               <w:numPr>
                 <w:ilvl w:val="0"/>
-                <w:numId w:val="3"/>
+                <w:numId w:val="14"/>
               </w:numPr>
-              <w:rPr>
-                <w:sz w:val="19"/>
-                <w:szCs w:val="19"/>
-              </w:rPr>
-            </w:pPr>
-            <w:r>
-              <w:rPr>
-                <w:sz w:val="19"/>
-                <w:szCs w:val="19"/>
-              </w:rPr>
-              <w:t>Interpretar as informações prestadas pelo cliente referentes as anomalias no sistema de carga e partida;</w:t>
+              <w:ind w:left="714" w:hanging="357"/>
+              <w:rPr>
+                <w:sz w:val="19"/>
+                <w:szCs w:val="19"/>
+              </w:rPr>
+            </w:pPr>
+            <w:r>
+              <w:rPr>
+                <w:sz w:val="19"/>
+                <w:szCs w:val="19"/>
+              </w:rPr>
+              <w:t>Medidas Preventivas</w:t>
             </w:r>
           </w:p>
           <w:p>
@@ -2182,19 +2469,20 @@
               <w:pStyle w:val="PargrafodaLista"/>
               <w:numPr>
                 <w:ilvl w:val="0"/>
-                <w:numId w:val="3"/>
+                <w:numId w:val="14"/>
               </w:numPr>
-              <w:rPr>
-                <w:sz w:val="19"/>
-                <w:szCs w:val="19"/>
-              </w:rPr>
-            </w:pPr>
-            <w:r>
-              <w:rPr>
-                <w:sz w:val="19"/>
-                <w:szCs w:val="19"/>
-              </w:rPr>
-              <w:t>Realizar diagnósticos do sistema de carga e partida;</w:t>
+              <w:ind w:left="714" w:hanging="357"/>
+              <w:rPr>
+                <w:sz w:val="19"/>
+                <w:szCs w:val="19"/>
+              </w:rPr>
+            </w:pPr>
+            <w:r>
+              <w:rPr>
+                <w:sz w:val="19"/>
+                <w:szCs w:val="19"/>
+              </w:rPr>
+              <w:t>Métodos de extinção</w:t>
             </w:r>
           </w:p>
           <w:p>
@@ -2202,19 +2490,43 @@
               <w:pStyle w:val="PargrafodaLista"/>
               <w:numPr>
                 <w:ilvl w:val="0"/>
-                <w:numId w:val="3"/>
+                <w:numId w:val="14"/>
               </w:numPr>
-              <w:rPr>
-                <w:sz w:val="19"/>
-                <w:szCs w:val="19"/>
-              </w:rPr>
-            </w:pPr>
-            <w:r>
-              <w:rPr>
-                <w:sz w:val="19"/>
-                <w:szCs w:val="19"/>
-              </w:rPr>
-              <w:t>Realizar remoção e reinstalação dos componentes dos sistemas de carga e partida;</w:t>
+              <w:ind w:left="714" w:hanging="357"/>
+              <w:rPr>
+                <w:sz w:val="19"/>
+                <w:szCs w:val="19"/>
+              </w:rPr>
+            </w:pPr>
+            <w:r>
+              <w:rPr>
+                <w:sz w:val="19"/>
+                <w:szCs w:val="19"/>
+              </w:rPr>
+              <w:t>Práticas</w:t>
+            </w:r>
+          </w:p>
+          <w:p>
+            <w:pPr>
+              <w:rPr>
+                <w:sz w:val="19"/>
+                <w:szCs w:val="19"/>
+              </w:rPr>
+            </w:pPr>
+            <w:r>
+              <w:rPr>
+                <w:sz w:val="19"/>
+                <w:szCs w:val="19"/>
+              </w:rPr>
+              <w:t>13.</w:t>
+            </w:r>
+            <w:r>
+              <w:rPr>
+                <w:sz w:val="19"/>
+                <w:szCs w:val="19"/>
+              </w:rPr>
+              <w:tab/>
+              <w:t>Acidentes de Origem Elétrica</w:t>
             </w:r>
           </w:p>
           <w:p>
@@ -2222,19 +2534,20 @@
               <w:pStyle w:val="PargrafodaLista"/>
               <w:numPr>
                 <w:ilvl w:val="0"/>
-                <w:numId w:val="3"/>
+                <w:numId w:val="15"/>
               </w:numPr>
-              <w:rPr>
-                <w:sz w:val="19"/>
-                <w:szCs w:val="19"/>
-              </w:rPr>
-            </w:pPr>
-            <w:r>
-              <w:rPr>
-                <w:sz w:val="19"/>
-                <w:szCs w:val="19"/>
-              </w:rPr>
-              <w:t>Realizar manutenção no alternador e no motor de partida de acordo com normas e procedimentos técnicos, considerando: Remover, Reparar, Testar e Reinstalar;</w:t>
+              <w:ind w:left="714" w:hanging="357"/>
+              <w:rPr>
+                <w:sz w:val="19"/>
+                <w:szCs w:val="19"/>
+              </w:rPr>
+            </w:pPr>
+            <w:r>
+              <w:rPr>
+                <w:sz w:val="19"/>
+                <w:szCs w:val="19"/>
+              </w:rPr>
+              <w:t>Causas diretas e indiretas</w:t>
             </w:r>
           </w:p>
           <w:p>
@@ -2242,19 +2555,35 @@
               <w:pStyle w:val="PargrafodaLista"/>
               <w:numPr>
                 <w:ilvl w:val="0"/>
-                <w:numId w:val="3"/>
+                <w:numId w:val="15"/>
               </w:numPr>
-              <w:rPr>
-                <w:sz w:val="19"/>
-                <w:szCs w:val="19"/>
-              </w:rPr>
-            </w:pPr>
-            <w:r>
-              <w:rPr>
-                <w:sz w:val="19"/>
-                <w:szCs w:val="19"/>
-              </w:rPr>
-              <w:t>Identificar os princípios de funcionamento dos sistemas de sinalização e iluminação;</w:t>
+              <w:ind w:left="714" w:hanging="357"/>
+              <w:rPr>
+                <w:sz w:val="19"/>
+                <w:szCs w:val="19"/>
+              </w:rPr>
+            </w:pPr>
+            <w:r>
+              <w:rPr>
+                <w:sz w:val="19"/>
+                <w:szCs w:val="19"/>
+              </w:rPr>
+              <w:t>Discussão de casos</w:t>
+            </w:r>
+          </w:p>
+          <w:p>
+            <w:pPr>
+              <w:rPr>
+                <w:sz w:val="19"/>
+                <w:szCs w:val="19"/>
+              </w:rPr>
+            </w:pPr>
+            <w:r>
+              <w:rPr>
+                <w:sz w:val="19"/>
+                <w:szCs w:val="19"/>
+              </w:rPr>
+              <w:t>14. Primeiros Socorros</w:t>
             </w:r>
           </w:p>
           <w:p>
@@ -2262,19 +2591,20 @@
               <w:pStyle w:val="PargrafodaLista"/>
               <w:numPr>
                 <w:ilvl w:val="0"/>
-                <w:numId w:val="3"/>
+                <w:numId w:val="16"/>
               </w:numPr>
-              <w:rPr>
-                <w:sz w:val="19"/>
-                <w:szCs w:val="19"/>
-              </w:rPr>
-            </w:pPr>
-            <w:r>
-              <w:rPr>
-                <w:sz w:val="19"/>
-                <w:szCs w:val="19"/>
-              </w:rPr>
-              <w:t>Interpretar as informações prestadas pelo cliente referentes aos defeitos no sistema de sinalização e iluminação;</w:t>
+              <w:ind w:left="714" w:hanging="357"/>
+              <w:rPr>
+                <w:sz w:val="19"/>
+                <w:szCs w:val="19"/>
+              </w:rPr>
+            </w:pPr>
+            <w:r>
+              <w:rPr>
+                <w:sz w:val="19"/>
+                <w:szCs w:val="19"/>
+              </w:rPr>
+              <w:t>Noções sobre lesões</w:t>
             </w:r>
           </w:p>
           <w:p>
@@ -2282,35 +2612,20 @@
               <w:pStyle w:val="PargrafodaLista"/>
               <w:numPr>
                 <w:ilvl w:val="0"/>
-                <w:numId w:val="3"/>
+                <w:numId w:val="16"/>
               </w:numPr>
-              <w:rPr>
-                <w:sz w:val="19"/>
-                <w:szCs w:val="19"/>
-              </w:rPr>
-            </w:pPr>
-            <w:r>
-              <w:rPr>
-                <w:sz w:val="19"/>
-                <w:szCs w:val="19"/>
-              </w:rPr>
-              <w:t xml:space="preserve">Realizar regulagem do farol com </w:t>
-            </w:r>
-            <w:proofErr w:type="spellStart"/>
-            <w:r>
-              <w:rPr>
-                <w:sz w:val="19"/>
-                <w:szCs w:val="19"/>
-              </w:rPr>
-              <w:t>Regloscópio</w:t>
-            </w:r>
-            <w:proofErr w:type="spellEnd"/>
-            <w:r>
-              <w:rPr>
-                <w:sz w:val="19"/>
-                <w:szCs w:val="19"/>
-              </w:rPr>
-              <w:t>;</w:t>
+              <w:ind w:left="714" w:hanging="357"/>
+              <w:rPr>
+                <w:sz w:val="19"/>
+                <w:szCs w:val="19"/>
+              </w:rPr>
+            </w:pPr>
+            <w:r>
+              <w:rPr>
+                <w:sz w:val="19"/>
+                <w:szCs w:val="19"/>
+              </w:rPr>
+              <w:t>Priorização do atendimento</w:t>
             </w:r>
           </w:p>
           <w:p>
@@ -2318,19 +2633,20 @@
               <w:pStyle w:val="PargrafodaLista"/>
               <w:numPr>
                 <w:ilvl w:val="0"/>
-                <w:numId w:val="3"/>
+                <w:numId w:val="16"/>
               </w:numPr>
-              <w:rPr>
-                <w:sz w:val="19"/>
-                <w:szCs w:val="19"/>
-              </w:rPr>
-            </w:pPr>
-            <w:r>
-              <w:rPr>
-                <w:sz w:val="19"/>
-                <w:szCs w:val="19"/>
-              </w:rPr>
-              <w:t>Realizar diagnósticos do sistema de sinalização e iluminação, considerando: Multímetro, Scanner e Osciloscópio;</w:t>
+              <w:ind w:left="714" w:hanging="357"/>
+              <w:rPr>
+                <w:sz w:val="19"/>
+                <w:szCs w:val="19"/>
+              </w:rPr>
+            </w:pPr>
+            <w:r>
+              <w:rPr>
+                <w:sz w:val="19"/>
+                <w:szCs w:val="19"/>
+              </w:rPr>
+              <w:t>Aplicação de respiração artificial</w:t>
             </w:r>
           </w:p>
           <w:p>
@@ -2338,19 +2654,77 @@
               <w:pStyle w:val="PargrafodaLista"/>
               <w:numPr>
                 <w:ilvl w:val="0"/>
-                <w:numId w:val="3"/>
+                <w:numId w:val="16"/>
               </w:numPr>
-              <w:rPr>
-                <w:sz w:val="19"/>
-                <w:szCs w:val="19"/>
-              </w:rPr>
-            </w:pPr>
-            <w:r>
-              <w:rPr>
-                <w:sz w:val="19"/>
-                <w:szCs w:val="19"/>
-              </w:rPr>
-              <w:t>Realizar manutenção dos sistemas de sinalização e iluminação de acordo com normas e procedimentos técnicos.</w:t>
+              <w:ind w:left="714" w:hanging="357"/>
+              <w:rPr>
+                <w:sz w:val="19"/>
+                <w:szCs w:val="19"/>
+              </w:rPr>
+            </w:pPr>
+            <w:r>
+              <w:rPr>
+                <w:sz w:val="19"/>
+                <w:szCs w:val="19"/>
+              </w:rPr>
+              <w:t>Massagem cardíaca</w:t>
+            </w:r>
+          </w:p>
+          <w:p>
+            <w:pPr>
+              <w:pStyle w:val="PargrafodaLista"/>
+              <w:numPr>
+                <w:ilvl w:val="0"/>
+                <w:numId w:val="16"/>
+              </w:numPr>
+              <w:ind w:left="714" w:hanging="357"/>
+              <w:rPr>
+                <w:sz w:val="19"/>
+                <w:szCs w:val="19"/>
+              </w:rPr>
+            </w:pPr>
+            <w:r>
+              <w:rPr>
+                <w:sz w:val="19"/>
+                <w:szCs w:val="19"/>
+              </w:rPr>
+              <w:t>Técnicas para remoção e transporte do acidentado</w:t>
+            </w:r>
+          </w:p>
+          <w:p>
+            <w:pPr>
+              <w:pStyle w:val="PargrafodaLista"/>
+              <w:numPr>
+                <w:ilvl w:val="0"/>
+                <w:numId w:val="16"/>
+              </w:numPr>
+              <w:ind w:left="714" w:hanging="357"/>
+              <w:rPr>
+                <w:sz w:val="19"/>
+                <w:szCs w:val="19"/>
+              </w:rPr>
+            </w:pPr>
+            <w:r>
+              <w:rPr>
+                <w:sz w:val="19"/>
+                <w:szCs w:val="19"/>
+              </w:rPr>
+              <w:t>Práticas</w:t>
+            </w:r>
+          </w:p>
+          <w:p>
+            <w:pPr>
+              <w:rPr>
+                <w:sz w:val="19"/>
+                <w:szCs w:val="19"/>
+              </w:rPr>
+            </w:pPr>
+            <w:r>
+              <w:rPr>
+                <w:sz w:val="19"/>
+                <w:szCs w:val="19"/>
+              </w:rPr>
+              <w:t>15. Responsabilidades</w:t>
             </w:r>
           </w:p>
         </w:tc>
@@ -2578,6 +2952,436 @@
 <file path=word/numbering.xml><?xml version="1.0" encoding="utf-8"?>
 <w:numbering xmlns:wpc="http://schemas.microsoft.com/office/word/2010/wordprocessingCanvas" xmlns:cx="http://schemas.microsoft.com/office/drawing/2014/chartex" xmlns:cx1="http://schemas.microsoft.com/office/drawing/2015/9/8/chartex" xmlns:cx2="http://schemas.microsoft.com/office/drawing/2015/10/21/chartex" xmlns:cx3="http://schemas.microsoft.com/office/drawing/2016/5/9/chartex" xmlns:cx4="http://schemas.microsoft.com/office/drawing/2016/5/10/chartex" xmlns:cx5="http://schemas.microsoft.com/office/drawing/2016/5/11/chartex" xmlns:cx6="http://schemas.microsoft.com/office/drawing/2016/5/12/chartex" xmlns:cx7="http://schemas.microsoft.com/office/drawing/2016/5/13/chartex" xmlns:cx8="http://schemas.microsoft.com/office/drawing/2016/5/14/chartex" xmlns:mc="http://schemas.openxmlformats.org/markup-compatibility/2006" xmlns:aink="http://schemas.microsoft.com/office/drawing/2016/ink" xmlns:am3d="http://schemas.microsoft.com/office/drawing/2017/model3d" xmlns:o="urn:schemas-microsoft-com:office:office" xmlns:oel="http://schemas.microsoft.com/office/2019/extlst" xmlns:r="http://schemas.openxmlformats.org/officeDocument/2006/relationships" xmlns:m="http://schemas.openxmlformats.org/officeDocument/2006/math" xmlns:v="urn:schemas-microsoft-com:vml" xmlns:wp14="http://schemas.microsoft.com/office/word/2010/wordprocessingDrawing" xmlns:wp="http://schemas.openxmlformats.org/drawingml/2006/wordprocessingDrawing" xmlns:w10="urn:schemas-microsoft-com:office:word" xmlns:w="http://schemas.openxmlformats.org/wordprocessingml/2006/main" xmlns:w14="http://schemas.microsoft.com/office/word/2010/wordml" xmlns:w15="http://schemas.microsoft.com/office/word/2012/wordml" xmlns:w16cex="http://schemas.microsoft.com/office/word/2018/wordml/cex" xmlns:w16cid="http://schemas.microsoft.com/office/word/2016/wordml/cid" xmlns:w16="http://schemas.microsoft.com/office/word/2018/wordml" xmlns:w16du="http://schemas.microsoft.com/office/word/2023/wordml/word16du" xmlns:w16sdtdh="http://schemas.microsoft.com/office/word/2020/wordml/sdtdatahash" xmlns:w16sdtfl="http://schemas.microsoft.com/office/word/2024/wordml/sdtformatlock" xmlns:w16se="http://schemas.microsoft.com/office/word/2015/wordml/symex" xmlns:wpg="http://schemas.microsoft.com/office/word/2010/wordprocessingGroup" xmlns:wpi="http://schemas.microsoft.com/office/word/2010/wordprocessingInk" xmlns:wne="http://schemas.microsoft.com/office/word/2006/wordml" xmlns:wps="http://schemas.microsoft.com/office/word/2010/wordprocessingShape" mc:Ignorable="w14 w15 w16se w16cid w16 w16cex w16sdtdh w16sdtfl w16du wp14">
   <w:abstractNum w:abstractNumId="0" w15:restartNumberingAfterBreak="0">
+    <w:nsid w:val="054D1099"/>
+    <w:multiLevelType w:val="hybridMultilevel"/>
+    <w:tmpl w:val="72221EE2"/>
+    <w:lvl w:ilvl="0" w:tplc="FFFFFFFF">
+      <w:start w:val="1"/>
+      <w:numFmt w:val="lowerLetter"/>
+      <w:lvlText w:val="%1)"/>
+      <w:lvlJc w:val="left"/>
+      <w:pPr>
+        <w:ind w:left="1434" w:hanging="360"/>
+      </w:pPr>
+    </w:lvl>
+    <w:lvl w:ilvl="1" w:tplc="FFFFFFFF" w:tentative="1">
+      <w:start w:val="1"/>
+      <w:numFmt w:val="lowerLetter"/>
+      <w:lvlText w:val="%2."/>
+      <w:lvlJc w:val="left"/>
+      <w:pPr>
+        <w:ind w:left="2154" w:hanging="360"/>
+      </w:pPr>
+    </w:lvl>
+    <w:lvl w:ilvl="2" w:tplc="FFFFFFFF" w:tentative="1">
+      <w:start w:val="1"/>
+      <w:numFmt w:val="lowerRoman"/>
+      <w:lvlText w:val="%3."/>
+      <w:lvlJc w:val="right"/>
+      <w:pPr>
+        <w:ind w:left="2874" w:hanging="180"/>
+      </w:pPr>
+    </w:lvl>
+    <w:lvl w:ilvl="3" w:tplc="FFFFFFFF" w:tentative="1">
+      <w:start w:val="1"/>
+      <w:numFmt w:val="decimal"/>
+      <w:lvlText w:val="%4."/>
+      <w:lvlJc w:val="left"/>
+      <w:pPr>
+        <w:ind w:left="3594" w:hanging="360"/>
+      </w:pPr>
+    </w:lvl>
+    <w:lvl w:ilvl="4" w:tplc="FFFFFFFF" w:tentative="1">
+      <w:start w:val="1"/>
+      <w:numFmt w:val="lowerLetter"/>
+      <w:lvlText w:val="%5."/>
+      <w:lvlJc w:val="left"/>
+      <w:pPr>
+        <w:ind w:left="4314" w:hanging="360"/>
+      </w:pPr>
+    </w:lvl>
+    <w:lvl w:ilvl="5" w:tplc="FFFFFFFF" w:tentative="1">
+      <w:start w:val="1"/>
+      <w:numFmt w:val="lowerRoman"/>
+      <w:lvlText w:val="%6."/>
+      <w:lvlJc w:val="right"/>
+      <w:pPr>
+        <w:ind w:left="5034" w:hanging="180"/>
+      </w:pPr>
+    </w:lvl>
+    <w:lvl w:ilvl="6" w:tplc="FFFFFFFF" w:tentative="1">
+      <w:start w:val="1"/>
+      <w:numFmt w:val="decimal"/>
+      <w:lvlText w:val="%7."/>
+      <w:lvlJc w:val="left"/>
+      <w:pPr>
+        <w:ind w:left="5754" w:hanging="360"/>
+      </w:pPr>
+    </w:lvl>
+    <w:lvl w:ilvl="7" w:tplc="FFFFFFFF" w:tentative="1">
+      <w:start w:val="1"/>
+      <w:numFmt w:val="lowerLetter"/>
+      <w:lvlText w:val="%8."/>
+      <w:lvlJc w:val="left"/>
+      <w:pPr>
+        <w:ind w:left="6474" w:hanging="360"/>
+      </w:pPr>
+    </w:lvl>
+    <w:lvl w:ilvl="8" w:tplc="FFFFFFFF" w:tentative="1">
+      <w:start w:val="1"/>
+      <w:numFmt w:val="lowerRoman"/>
+      <w:lvlText w:val="%9."/>
+      <w:lvlJc w:val="right"/>
+      <w:pPr>
+        <w:ind w:left="7194" w:hanging="180"/>
+      </w:pPr>
+    </w:lvl>
+  </w:abstractNum>
+  <w:abstractNum w:abstractNumId="1" w15:restartNumberingAfterBreak="0">
+    <w:nsid w:val="08DD3B67"/>
+    <w:multiLevelType w:val="hybridMultilevel"/>
+    <w:tmpl w:val="613A7F76"/>
+    <w:lvl w:ilvl="0" w:tplc="04160017">
+      <w:start w:val="1"/>
+      <w:numFmt w:val="lowerLetter"/>
+      <w:lvlText w:val="%1)"/>
+      <w:lvlJc w:val="left"/>
+      <w:pPr>
+        <w:ind w:left="1434" w:hanging="360"/>
+      </w:pPr>
+    </w:lvl>
+    <w:lvl w:ilvl="1" w:tplc="04160019" w:tentative="1">
+      <w:start w:val="1"/>
+      <w:numFmt w:val="lowerLetter"/>
+      <w:lvlText w:val="%2."/>
+      <w:lvlJc w:val="left"/>
+      <w:pPr>
+        <w:ind w:left="2154" w:hanging="360"/>
+      </w:pPr>
+    </w:lvl>
+    <w:lvl w:ilvl="2" w:tplc="0416001B" w:tentative="1">
+      <w:start w:val="1"/>
+      <w:numFmt w:val="lowerRoman"/>
+      <w:lvlText w:val="%3."/>
+      <w:lvlJc w:val="right"/>
+      <w:pPr>
+        <w:ind w:left="2874" w:hanging="180"/>
+      </w:pPr>
+    </w:lvl>
+    <w:lvl w:ilvl="3" w:tplc="0416000F" w:tentative="1">
+      <w:start w:val="1"/>
+      <w:numFmt w:val="decimal"/>
+      <w:lvlText w:val="%4."/>
+      <w:lvlJc w:val="left"/>
+      <w:pPr>
+        <w:ind w:left="3594" w:hanging="360"/>
+      </w:pPr>
+    </w:lvl>
+    <w:lvl w:ilvl="4" w:tplc="04160019" w:tentative="1">
+      <w:start w:val="1"/>
+      <w:numFmt w:val="lowerLetter"/>
+      <w:lvlText w:val="%5."/>
+      <w:lvlJc w:val="left"/>
+      <w:pPr>
+        <w:ind w:left="4314" w:hanging="360"/>
+      </w:pPr>
+    </w:lvl>
+    <w:lvl w:ilvl="5" w:tplc="0416001B" w:tentative="1">
+      <w:start w:val="1"/>
+      <w:numFmt w:val="lowerRoman"/>
+      <w:lvlText w:val="%6."/>
+      <w:lvlJc w:val="right"/>
+      <w:pPr>
+        <w:ind w:left="5034" w:hanging="180"/>
+      </w:pPr>
+    </w:lvl>
+    <w:lvl w:ilvl="6" w:tplc="0416000F" w:tentative="1">
+      <w:start w:val="1"/>
+      <w:numFmt w:val="decimal"/>
+      <w:lvlText w:val="%7."/>
+      <w:lvlJc w:val="left"/>
+      <w:pPr>
+        <w:ind w:left="5754" w:hanging="360"/>
+      </w:pPr>
+    </w:lvl>
+    <w:lvl w:ilvl="7" w:tplc="04160019" w:tentative="1">
+      <w:start w:val="1"/>
+      <w:numFmt w:val="lowerLetter"/>
+      <w:lvlText w:val="%8."/>
+      <w:lvlJc w:val="left"/>
+      <w:pPr>
+        <w:ind w:left="6474" w:hanging="360"/>
+      </w:pPr>
+    </w:lvl>
+    <w:lvl w:ilvl="8" w:tplc="0416001B" w:tentative="1">
+      <w:start w:val="1"/>
+      <w:numFmt w:val="lowerRoman"/>
+      <w:lvlText w:val="%9."/>
+      <w:lvlJc w:val="right"/>
+      <w:pPr>
+        <w:ind w:left="7194" w:hanging="180"/>
+      </w:pPr>
+    </w:lvl>
+  </w:abstractNum>
+  <w:abstractNum w:abstractNumId="2" w15:restartNumberingAfterBreak="0">
+    <w:nsid w:val="0D6D4803"/>
+    <w:multiLevelType w:val="hybridMultilevel"/>
+    <w:tmpl w:val="72221EE2"/>
+    <w:lvl w:ilvl="0" w:tplc="FFFFFFFF">
+      <w:start w:val="1"/>
+      <w:numFmt w:val="lowerLetter"/>
+      <w:lvlText w:val="%1)"/>
+      <w:lvlJc w:val="left"/>
+      <w:pPr>
+        <w:ind w:left="1434" w:hanging="360"/>
+      </w:pPr>
+    </w:lvl>
+    <w:lvl w:ilvl="1" w:tplc="FFFFFFFF" w:tentative="1">
+      <w:start w:val="1"/>
+      <w:numFmt w:val="lowerLetter"/>
+      <w:lvlText w:val="%2."/>
+      <w:lvlJc w:val="left"/>
+      <w:pPr>
+        <w:ind w:left="2154" w:hanging="360"/>
+      </w:pPr>
+    </w:lvl>
+    <w:lvl w:ilvl="2" w:tplc="FFFFFFFF" w:tentative="1">
+      <w:start w:val="1"/>
+      <w:numFmt w:val="lowerRoman"/>
+      <w:lvlText w:val="%3."/>
+      <w:lvlJc w:val="right"/>
+      <w:pPr>
+        <w:ind w:left="2874" w:hanging="180"/>
+      </w:pPr>
+    </w:lvl>
+    <w:lvl w:ilvl="3" w:tplc="FFFFFFFF" w:tentative="1">
+      <w:start w:val="1"/>
+      <w:numFmt w:val="decimal"/>
+      <w:lvlText w:val="%4."/>
+      <w:lvlJc w:val="left"/>
+      <w:pPr>
+        <w:ind w:left="3594" w:hanging="360"/>
+      </w:pPr>
+    </w:lvl>
+    <w:lvl w:ilvl="4" w:tplc="FFFFFFFF" w:tentative="1">
+      <w:start w:val="1"/>
+      <w:numFmt w:val="lowerLetter"/>
+      <w:lvlText w:val="%5."/>
+      <w:lvlJc w:val="left"/>
+      <w:pPr>
+        <w:ind w:left="4314" w:hanging="360"/>
+      </w:pPr>
+    </w:lvl>
+    <w:lvl w:ilvl="5" w:tplc="FFFFFFFF" w:tentative="1">
+      <w:start w:val="1"/>
+      <w:numFmt w:val="lowerRoman"/>
+      <w:lvlText w:val="%6."/>
+      <w:lvlJc w:val="right"/>
+      <w:pPr>
+        <w:ind w:left="5034" w:hanging="180"/>
+      </w:pPr>
+    </w:lvl>
+    <w:lvl w:ilvl="6" w:tplc="FFFFFFFF" w:tentative="1">
+      <w:start w:val="1"/>
+      <w:numFmt w:val="decimal"/>
+      <w:lvlText w:val="%7."/>
+      <w:lvlJc w:val="left"/>
+      <w:pPr>
+        <w:ind w:left="5754" w:hanging="360"/>
+      </w:pPr>
+    </w:lvl>
+    <w:lvl w:ilvl="7" w:tplc="FFFFFFFF" w:tentative="1">
+      <w:start w:val="1"/>
+      <w:numFmt w:val="lowerLetter"/>
+      <w:lvlText w:val="%8."/>
+      <w:lvlJc w:val="left"/>
+      <w:pPr>
+        <w:ind w:left="6474" w:hanging="360"/>
+      </w:pPr>
+    </w:lvl>
+    <w:lvl w:ilvl="8" w:tplc="FFFFFFFF" w:tentative="1">
+      <w:start w:val="1"/>
+      <w:numFmt w:val="lowerRoman"/>
+      <w:lvlText w:val="%9."/>
+      <w:lvlJc w:val="right"/>
+      <w:pPr>
+        <w:ind w:left="7194" w:hanging="180"/>
+      </w:pPr>
+    </w:lvl>
+  </w:abstractNum>
+  <w:abstractNum w:abstractNumId="3" w15:restartNumberingAfterBreak="0">
+    <w:nsid w:val="0E021A6A"/>
+    <w:multiLevelType w:val="hybridMultilevel"/>
+    <w:tmpl w:val="72221EE2"/>
+    <w:lvl w:ilvl="0" w:tplc="FFFFFFFF">
+      <w:start w:val="1"/>
+      <w:numFmt w:val="lowerLetter"/>
+      <w:lvlText w:val="%1)"/>
+      <w:lvlJc w:val="left"/>
+      <w:pPr>
+        <w:ind w:left="1434" w:hanging="360"/>
+      </w:pPr>
+    </w:lvl>
+    <w:lvl w:ilvl="1" w:tplc="FFFFFFFF" w:tentative="1">
+      <w:start w:val="1"/>
+      <w:numFmt w:val="lowerLetter"/>
+      <w:lvlText w:val="%2."/>
+      <w:lvlJc w:val="left"/>
+      <w:pPr>
+        <w:ind w:left="2154" w:hanging="360"/>
+      </w:pPr>
+    </w:lvl>
+    <w:lvl w:ilvl="2" w:tplc="FFFFFFFF" w:tentative="1">
+      <w:start w:val="1"/>
+      <w:numFmt w:val="lowerRoman"/>
+      <w:lvlText w:val="%3."/>
+      <w:lvlJc w:val="right"/>
+      <w:pPr>
+        <w:ind w:left="2874" w:hanging="180"/>
+      </w:pPr>
+    </w:lvl>
+    <w:lvl w:ilvl="3" w:tplc="FFFFFFFF" w:tentative="1">
+      <w:start w:val="1"/>
+      <w:numFmt w:val="decimal"/>
+      <w:lvlText w:val="%4."/>
+      <w:lvlJc w:val="left"/>
+      <w:pPr>
+        <w:ind w:left="3594" w:hanging="360"/>
+      </w:pPr>
+    </w:lvl>
+    <w:lvl w:ilvl="4" w:tplc="FFFFFFFF" w:tentative="1">
+      <w:start w:val="1"/>
+      <w:numFmt w:val="lowerLetter"/>
+      <w:lvlText w:val="%5."/>
+      <w:lvlJc w:val="left"/>
+      <w:pPr>
+        <w:ind w:left="4314" w:hanging="360"/>
+      </w:pPr>
+    </w:lvl>
+    <w:lvl w:ilvl="5" w:tplc="FFFFFFFF" w:tentative="1">
+      <w:start w:val="1"/>
+      <w:numFmt w:val="lowerRoman"/>
+      <w:lvlText w:val="%6."/>
+      <w:lvlJc w:val="right"/>
+      <w:pPr>
+        <w:ind w:left="5034" w:hanging="180"/>
+      </w:pPr>
+    </w:lvl>
+    <w:lvl w:ilvl="6" w:tplc="FFFFFFFF" w:tentative="1">
+      <w:start w:val="1"/>
+      <w:numFmt w:val="decimal"/>
+      <w:lvlText w:val="%7."/>
+      <w:lvlJc w:val="left"/>
+      <w:pPr>
+        <w:ind w:left="5754" w:hanging="360"/>
+      </w:pPr>
+    </w:lvl>
+    <w:lvl w:ilvl="7" w:tplc="FFFFFFFF" w:tentative="1">
+      <w:start w:val="1"/>
+      <w:numFmt w:val="lowerLetter"/>
+      <w:lvlText w:val="%8."/>
+      <w:lvlJc w:val="left"/>
+      <w:pPr>
+        <w:ind w:left="6474" w:hanging="360"/>
+      </w:pPr>
+    </w:lvl>
+    <w:lvl w:ilvl="8" w:tplc="FFFFFFFF" w:tentative="1">
+      <w:start w:val="1"/>
+      <w:numFmt w:val="lowerRoman"/>
+      <w:lvlText w:val="%9."/>
+      <w:lvlJc w:val="right"/>
+      <w:pPr>
+        <w:ind w:left="7194" w:hanging="180"/>
+      </w:pPr>
+    </w:lvl>
+  </w:abstractNum>
+  <w:abstractNum w:abstractNumId="4" w15:restartNumberingAfterBreak="0">
+    <w:nsid w:val="14497322"/>
+    <w:multiLevelType w:val="hybridMultilevel"/>
+    <w:tmpl w:val="72221EE2"/>
+    <w:lvl w:ilvl="0" w:tplc="FFFFFFFF">
+      <w:start w:val="1"/>
+      <w:numFmt w:val="lowerLetter"/>
+      <w:lvlText w:val="%1)"/>
+      <w:lvlJc w:val="left"/>
+      <w:pPr>
+        <w:ind w:left="1434" w:hanging="360"/>
+      </w:pPr>
+    </w:lvl>
+    <w:lvl w:ilvl="1" w:tplc="FFFFFFFF" w:tentative="1">
+      <w:start w:val="1"/>
+      <w:numFmt w:val="lowerLetter"/>
+      <w:lvlText w:val="%2."/>
+      <w:lvlJc w:val="left"/>
+      <w:pPr>
+        <w:ind w:left="2154" w:hanging="360"/>
+      </w:pPr>
+    </w:lvl>
+    <w:lvl w:ilvl="2" w:tplc="FFFFFFFF" w:tentative="1">
+      <w:start w:val="1"/>
+      <w:numFmt w:val="lowerRoman"/>
+      <w:lvlText w:val="%3."/>
+      <w:lvlJc w:val="right"/>
+      <w:pPr>
+        <w:ind w:left="2874" w:hanging="180"/>
+      </w:pPr>
+    </w:lvl>
+    <w:lvl w:ilvl="3" w:tplc="FFFFFFFF" w:tentative="1">
+      <w:start w:val="1"/>
+      <w:numFmt w:val="decimal"/>
+      <w:lvlText w:val="%4."/>
+      <w:lvlJc w:val="left"/>
+      <w:pPr>
+        <w:ind w:left="3594" w:hanging="360"/>
+      </w:pPr>
+    </w:lvl>
+    <w:lvl w:ilvl="4" w:tplc="FFFFFFFF" w:tentative="1">
+      <w:start w:val="1"/>
+      <w:numFmt w:val="lowerLetter"/>
+      <w:lvlText w:val="%5."/>
+      <w:lvlJc w:val="left"/>
+      <w:pPr>
+        <w:ind w:left="4314" w:hanging="360"/>
+      </w:pPr>
+    </w:lvl>
+    <w:lvl w:ilvl="5" w:tplc="FFFFFFFF" w:tentative="1">
+      <w:start w:val="1"/>
+      <w:numFmt w:val="lowerRoman"/>
+      <w:lvlText w:val="%6."/>
+      <w:lvlJc w:val="right"/>
+      <w:pPr>
+        <w:ind w:left="5034" w:hanging="180"/>
+      </w:pPr>
+    </w:lvl>
+    <w:lvl w:ilvl="6" w:tplc="FFFFFFFF" w:tentative="1">
+      <w:start w:val="1"/>
+      <w:numFmt w:val="decimal"/>
+      <w:lvlText w:val="%7."/>
+      <w:lvlJc w:val="left"/>
+      <w:pPr>
+        <w:ind w:left="5754" w:hanging="360"/>
+      </w:pPr>
+    </w:lvl>
+    <w:lvl w:ilvl="7" w:tplc="FFFFFFFF" w:tentative="1">
+      <w:start w:val="1"/>
+      <w:numFmt w:val="lowerLetter"/>
+      <w:lvlText w:val="%8."/>
+      <w:lvlJc w:val="left"/>
+      <w:pPr>
+        <w:ind w:left="6474" w:hanging="360"/>
+      </w:pPr>
+    </w:lvl>
+    <w:lvl w:ilvl="8" w:tplc="FFFFFFFF" w:tentative="1">
+      <w:start w:val="1"/>
+      <w:numFmt w:val="lowerRoman"/>
+      <w:lvlText w:val="%9."/>
+      <w:lvlJc w:val="right"/>
+      <w:pPr>
+        <w:ind w:left="7194" w:hanging="180"/>
+      </w:pPr>
+    </w:lvl>
+  </w:abstractNum>
+  <w:abstractNum w:abstractNumId="5" w15:restartNumberingAfterBreak="0">
     <w:nsid w:val="187755ED"/>
     <w:multiLevelType w:val="hybridMultilevel"/>
     <w:tmpl w:val="4C5260BA"/>
@@ -2690,7 +3494,268 @@
       </w:rPr>
     </w:lvl>
   </w:abstractNum>
-  <w:abstractNum w:abstractNumId="1" w15:restartNumberingAfterBreak="0">
+  <w:abstractNum w:abstractNumId="6" w15:restartNumberingAfterBreak="0">
+    <w:nsid w:val="287268AF"/>
+    <w:multiLevelType w:val="hybridMultilevel"/>
+    <w:tmpl w:val="72221EE2"/>
+    <w:lvl w:ilvl="0" w:tplc="FFFFFFFF">
+      <w:start w:val="1"/>
+      <w:numFmt w:val="lowerLetter"/>
+      <w:lvlText w:val="%1)"/>
+      <w:lvlJc w:val="left"/>
+      <w:pPr>
+        <w:ind w:left="1434" w:hanging="360"/>
+      </w:pPr>
+    </w:lvl>
+    <w:lvl w:ilvl="1" w:tplc="FFFFFFFF" w:tentative="1">
+      <w:start w:val="1"/>
+      <w:numFmt w:val="lowerLetter"/>
+      <w:lvlText w:val="%2."/>
+      <w:lvlJc w:val="left"/>
+      <w:pPr>
+        <w:ind w:left="2154" w:hanging="360"/>
+      </w:pPr>
+    </w:lvl>
+    <w:lvl w:ilvl="2" w:tplc="FFFFFFFF" w:tentative="1">
+      <w:start w:val="1"/>
+      <w:numFmt w:val="lowerRoman"/>
+      <w:lvlText w:val="%3."/>
+      <w:lvlJc w:val="right"/>
+      <w:pPr>
+        <w:ind w:left="2874" w:hanging="180"/>
+      </w:pPr>
+    </w:lvl>
+    <w:lvl w:ilvl="3" w:tplc="FFFFFFFF" w:tentative="1">
+      <w:start w:val="1"/>
+      <w:numFmt w:val="decimal"/>
+      <w:lvlText w:val="%4."/>
+      <w:lvlJc w:val="left"/>
+      <w:pPr>
+        <w:ind w:left="3594" w:hanging="360"/>
+      </w:pPr>
+    </w:lvl>
+    <w:lvl w:ilvl="4" w:tplc="FFFFFFFF" w:tentative="1">
+      <w:start w:val="1"/>
+      <w:numFmt w:val="lowerLetter"/>
+      <w:lvlText w:val="%5."/>
+      <w:lvlJc w:val="left"/>
+      <w:pPr>
+        <w:ind w:left="4314" w:hanging="360"/>
+      </w:pPr>
+    </w:lvl>
+    <w:lvl w:ilvl="5" w:tplc="FFFFFFFF" w:tentative="1">
+      <w:start w:val="1"/>
+      <w:numFmt w:val="lowerRoman"/>
+      <w:lvlText w:val="%6."/>
+      <w:lvlJc w:val="right"/>
+      <w:pPr>
+        <w:ind w:left="5034" w:hanging="180"/>
+      </w:pPr>
+    </w:lvl>
+    <w:lvl w:ilvl="6" w:tplc="FFFFFFFF" w:tentative="1">
+      <w:start w:val="1"/>
+      <w:numFmt w:val="decimal"/>
+      <w:lvlText w:val="%7."/>
+      <w:lvlJc w:val="left"/>
+      <w:pPr>
+        <w:ind w:left="5754" w:hanging="360"/>
+      </w:pPr>
+    </w:lvl>
+    <w:lvl w:ilvl="7" w:tplc="FFFFFFFF" w:tentative="1">
+      <w:start w:val="1"/>
+      <w:numFmt w:val="lowerLetter"/>
+      <w:lvlText w:val="%8."/>
+      <w:lvlJc w:val="left"/>
+      <w:pPr>
+        <w:ind w:left="6474" w:hanging="360"/>
+      </w:pPr>
+    </w:lvl>
+    <w:lvl w:ilvl="8" w:tplc="FFFFFFFF" w:tentative="1">
+      <w:start w:val="1"/>
+      <w:numFmt w:val="lowerRoman"/>
+      <w:lvlText w:val="%9."/>
+      <w:lvlJc w:val="right"/>
+      <w:pPr>
+        <w:ind w:left="7194" w:hanging="180"/>
+      </w:pPr>
+    </w:lvl>
+  </w:abstractNum>
+  <w:abstractNum w:abstractNumId="7" w15:restartNumberingAfterBreak="0">
+    <w:nsid w:val="2E256C35"/>
+    <w:multiLevelType w:val="hybridMultilevel"/>
+    <w:tmpl w:val="07780A22"/>
+    <w:lvl w:ilvl="0" w:tplc="9EE66E0A">
+      <w:start w:val="1"/>
+      <w:numFmt w:val="lowerLetter"/>
+      <w:lvlText w:val="%1)"/>
+      <w:lvlJc w:val="left"/>
+      <w:pPr>
+        <w:ind w:left="1410" w:hanging="696"/>
+      </w:pPr>
+      <w:rPr>
+        <w:rFonts w:hint="default"/>
+      </w:rPr>
+    </w:lvl>
+    <w:lvl w:ilvl="1" w:tplc="04160019" w:tentative="1">
+      <w:start w:val="1"/>
+      <w:numFmt w:val="lowerLetter"/>
+      <w:lvlText w:val="%2."/>
+      <w:lvlJc w:val="left"/>
+      <w:pPr>
+        <w:ind w:left="1794" w:hanging="360"/>
+      </w:pPr>
+    </w:lvl>
+    <w:lvl w:ilvl="2" w:tplc="0416001B" w:tentative="1">
+      <w:start w:val="1"/>
+      <w:numFmt w:val="lowerRoman"/>
+      <w:lvlText w:val="%3."/>
+      <w:lvlJc w:val="right"/>
+      <w:pPr>
+        <w:ind w:left="2514" w:hanging="180"/>
+      </w:pPr>
+    </w:lvl>
+    <w:lvl w:ilvl="3" w:tplc="0416000F" w:tentative="1">
+      <w:start w:val="1"/>
+      <w:numFmt w:val="decimal"/>
+      <w:lvlText w:val="%4."/>
+      <w:lvlJc w:val="left"/>
+      <w:pPr>
+        <w:ind w:left="3234" w:hanging="360"/>
+      </w:pPr>
+    </w:lvl>
+    <w:lvl w:ilvl="4" w:tplc="04160019" w:tentative="1">
+      <w:start w:val="1"/>
+      <w:numFmt w:val="lowerLetter"/>
+      <w:lvlText w:val="%5."/>
+      <w:lvlJc w:val="left"/>
+      <w:pPr>
+        <w:ind w:left="3954" w:hanging="360"/>
+      </w:pPr>
+    </w:lvl>
+    <w:lvl w:ilvl="5" w:tplc="0416001B" w:tentative="1">
+      <w:start w:val="1"/>
+      <w:numFmt w:val="lowerRoman"/>
+      <w:lvlText w:val="%6."/>
+      <w:lvlJc w:val="right"/>
+      <w:pPr>
+        <w:ind w:left="4674" w:hanging="180"/>
+      </w:pPr>
+    </w:lvl>
+    <w:lvl w:ilvl="6" w:tplc="0416000F" w:tentative="1">
+      <w:start w:val="1"/>
+      <w:numFmt w:val="decimal"/>
+      <w:lvlText w:val="%7."/>
+      <w:lvlJc w:val="left"/>
+      <w:pPr>
+        <w:ind w:left="5394" w:hanging="360"/>
+      </w:pPr>
+    </w:lvl>
+    <w:lvl w:ilvl="7" w:tplc="04160019" w:tentative="1">
+      <w:start w:val="1"/>
+      <w:numFmt w:val="lowerLetter"/>
+      <w:lvlText w:val="%8."/>
+      <w:lvlJc w:val="left"/>
+      <w:pPr>
+        <w:ind w:left="6114" w:hanging="360"/>
+      </w:pPr>
+    </w:lvl>
+    <w:lvl w:ilvl="8" w:tplc="0416001B" w:tentative="1">
+      <w:start w:val="1"/>
+      <w:numFmt w:val="lowerRoman"/>
+      <w:lvlText w:val="%9."/>
+      <w:lvlJc w:val="right"/>
+      <w:pPr>
+        <w:ind w:left="6834" w:hanging="180"/>
+      </w:pPr>
+    </w:lvl>
+  </w:abstractNum>
+  <w:abstractNum w:abstractNumId="8" w15:restartNumberingAfterBreak="0">
+    <w:nsid w:val="42667704"/>
+    <w:multiLevelType w:val="hybridMultilevel"/>
+    <w:tmpl w:val="6BC4C2E0"/>
+    <w:lvl w:ilvl="0" w:tplc="04160017">
+      <w:start w:val="1"/>
+      <w:numFmt w:val="lowerLetter"/>
+      <w:lvlText w:val="%1)"/>
+      <w:lvlJc w:val="left"/>
+      <w:pPr>
+        <w:ind w:left="1434" w:hanging="360"/>
+      </w:pPr>
+    </w:lvl>
+    <w:lvl w:ilvl="1" w:tplc="04160019" w:tentative="1">
+      <w:start w:val="1"/>
+      <w:numFmt w:val="lowerLetter"/>
+      <w:lvlText w:val="%2."/>
+      <w:lvlJc w:val="left"/>
+      <w:pPr>
+        <w:ind w:left="2154" w:hanging="360"/>
+      </w:pPr>
+    </w:lvl>
+    <w:lvl w:ilvl="2" w:tplc="0416001B" w:tentative="1">
+      <w:start w:val="1"/>
+      <w:numFmt w:val="lowerRoman"/>
+      <w:lvlText w:val="%3."/>
+      <w:lvlJc w:val="right"/>
+      <w:pPr>
+        <w:ind w:left="2874" w:hanging="180"/>
+      </w:pPr>
+    </w:lvl>
+    <w:lvl w:ilvl="3" w:tplc="0416000F" w:tentative="1">
+      <w:start w:val="1"/>
+      <w:numFmt w:val="decimal"/>
+      <w:lvlText w:val="%4."/>
+      <w:lvlJc w:val="left"/>
+      <w:pPr>
+        <w:ind w:left="3594" w:hanging="360"/>
+      </w:pPr>
+    </w:lvl>
+    <w:lvl w:ilvl="4" w:tplc="04160019" w:tentative="1">
+      <w:start w:val="1"/>
+      <w:numFmt w:val="lowerLetter"/>
+      <w:lvlText w:val="%5."/>
+      <w:lvlJc w:val="left"/>
+      <w:pPr>
+        <w:ind w:left="4314" w:hanging="360"/>
+      </w:pPr>
+    </w:lvl>
+    <w:lvl w:ilvl="5" w:tplc="0416001B" w:tentative="1">
+      <w:start w:val="1"/>
+      <w:numFmt w:val="lowerRoman"/>
+      <w:lvlText w:val="%6."/>
+      <w:lvlJc w:val="right"/>
+      <w:pPr>
+        <w:ind w:left="5034" w:hanging="180"/>
+      </w:pPr>
+    </w:lvl>
+    <w:lvl w:ilvl="6" w:tplc="0416000F" w:tentative="1">
+      <w:start w:val="1"/>
+      <w:numFmt w:val="decimal"/>
+      <w:lvlText w:val="%7."/>
+      <w:lvlJc w:val="left"/>
+      <w:pPr>
+        <w:ind w:left="5754" w:hanging="360"/>
+      </w:pPr>
+    </w:lvl>
+    <w:lvl w:ilvl="7" w:tplc="04160019" w:tentative="1">
+      <w:start w:val="1"/>
+      <w:numFmt w:val="lowerLetter"/>
+      <w:lvlText w:val="%8."/>
+      <w:lvlJc w:val="left"/>
+      <w:pPr>
+        <w:ind w:left="6474" w:hanging="360"/>
+      </w:pPr>
+    </w:lvl>
+    <w:lvl w:ilvl="8" w:tplc="0416001B" w:tentative="1">
+      <w:start w:val="1"/>
+      <w:numFmt w:val="lowerRoman"/>
+      <w:lvlText w:val="%9."/>
+      <w:lvlJc w:val="right"/>
+      <w:pPr>
+        <w:ind w:left="7194" w:hanging="180"/>
+      </w:pPr>
+    </w:lvl>
+  </w:abstractNum>
+  <w:abstractNum w:abstractNumId="9" w15:restartNumberingAfterBreak="0">
     <w:nsid w:val="47EA1C13"/>
     <w:multiLevelType w:val="hybridMultilevel"/>
     <w:tmpl w:val="6FBAB5CC"/>
@@ -2803,7 +3868,179 @@
       </w:rPr>
     </w:lvl>
   </w:abstractNum>
-  <w:abstractNum w:abstractNumId="2" w15:restartNumberingAfterBreak="0">
+  <w:abstractNum w:abstractNumId="10" w15:restartNumberingAfterBreak="0">
+    <w:nsid w:val="4A9F090D"/>
+    <w:multiLevelType w:val="hybridMultilevel"/>
+    <w:tmpl w:val="72221EE2"/>
+    <w:lvl w:ilvl="0" w:tplc="FFFFFFFF">
+      <w:start w:val="1"/>
+      <w:numFmt w:val="lowerLetter"/>
+      <w:lvlText w:val="%1)"/>
+      <w:lvlJc w:val="left"/>
+      <w:pPr>
+        <w:ind w:left="1434" w:hanging="360"/>
+      </w:pPr>
+    </w:lvl>
+    <w:lvl w:ilvl="1" w:tplc="FFFFFFFF" w:tentative="1">
+      <w:start w:val="1"/>
+      <w:numFmt w:val="lowerLetter"/>
+      <w:lvlText w:val="%2."/>
+      <w:lvlJc w:val="left"/>
+      <w:pPr>
+        <w:ind w:left="2154" w:hanging="360"/>
+      </w:pPr>
+    </w:lvl>
+    <w:lvl w:ilvl="2" w:tplc="FFFFFFFF" w:tentative="1">
+      <w:start w:val="1"/>
+      <w:numFmt w:val="lowerRoman"/>
+      <w:lvlText w:val="%3."/>
+      <w:lvlJc w:val="right"/>
+      <w:pPr>
+        <w:ind w:left="2874" w:hanging="180"/>
+      </w:pPr>
+    </w:lvl>
+    <w:lvl w:ilvl="3" w:tplc="FFFFFFFF" w:tentative="1">
+      <w:start w:val="1"/>
+      <w:numFmt w:val="decimal"/>
+      <w:lvlText w:val="%4."/>
+      <w:lvlJc w:val="left"/>
+      <w:pPr>
+        <w:ind w:left="3594" w:hanging="360"/>
+      </w:pPr>
+    </w:lvl>
+    <w:lvl w:ilvl="4" w:tplc="FFFFFFFF" w:tentative="1">
+      <w:start w:val="1"/>
+      <w:numFmt w:val="lowerLetter"/>
+      <w:lvlText w:val="%5."/>
+      <w:lvlJc w:val="left"/>
+      <w:pPr>
+        <w:ind w:left="4314" w:hanging="360"/>
+      </w:pPr>
+    </w:lvl>
+    <w:lvl w:ilvl="5" w:tplc="FFFFFFFF" w:tentative="1">
+      <w:start w:val="1"/>
+      <w:numFmt w:val="lowerRoman"/>
+      <w:lvlText w:val="%6."/>
+      <w:lvlJc w:val="right"/>
+      <w:pPr>
+        <w:ind w:left="5034" w:hanging="180"/>
+      </w:pPr>
+    </w:lvl>
+    <w:lvl w:ilvl="6" w:tplc="FFFFFFFF" w:tentative="1">
+      <w:start w:val="1"/>
+      <w:numFmt w:val="decimal"/>
+      <w:lvlText w:val="%7."/>
+      <w:lvlJc w:val="left"/>
+      <w:pPr>
+        <w:ind w:left="5754" w:hanging="360"/>
+      </w:pPr>
+    </w:lvl>
+    <w:lvl w:ilvl="7" w:tplc="FFFFFFFF" w:tentative="1">
+      <w:start w:val="1"/>
+      <w:numFmt w:val="lowerLetter"/>
+      <w:lvlText w:val="%8."/>
+      <w:lvlJc w:val="left"/>
+      <w:pPr>
+        <w:ind w:left="6474" w:hanging="360"/>
+      </w:pPr>
+    </w:lvl>
+    <w:lvl w:ilvl="8" w:tplc="FFFFFFFF" w:tentative="1">
+      <w:start w:val="1"/>
+      <w:numFmt w:val="lowerRoman"/>
+      <w:lvlText w:val="%9."/>
+      <w:lvlJc w:val="right"/>
+      <w:pPr>
+        <w:ind w:left="7194" w:hanging="180"/>
+      </w:pPr>
+    </w:lvl>
+  </w:abstractNum>
+  <w:abstractNum w:abstractNumId="11" w15:restartNumberingAfterBreak="0">
+    <w:nsid w:val="4D951B69"/>
+    <w:multiLevelType w:val="hybridMultilevel"/>
+    <w:tmpl w:val="72221EE2"/>
+    <w:lvl w:ilvl="0" w:tplc="04160017">
+      <w:start w:val="1"/>
+      <w:numFmt w:val="lowerLetter"/>
+      <w:lvlText w:val="%1)"/>
+      <w:lvlJc w:val="left"/>
+      <w:pPr>
+        <w:ind w:left="1434" w:hanging="360"/>
+      </w:pPr>
+    </w:lvl>
+    <w:lvl w:ilvl="1" w:tplc="04160019" w:tentative="1">
+      <w:start w:val="1"/>
+      <w:numFmt w:val="lowerLetter"/>
+      <w:lvlText w:val="%2."/>
+      <w:lvlJc w:val="left"/>
+      <w:pPr>
+        <w:ind w:left="2154" w:hanging="360"/>
+      </w:pPr>
+    </w:lvl>
+    <w:lvl w:ilvl="2" w:tplc="0416001B" w:tentative="1">
+      <w:start w:val="1"/>
+      <w:numFmt w:val="lowerRoman"/>
+      <w:lvlText w:val="%3."/>
+      <w:lvlJc w:val="right"/>
+      <w:pPr>
+        <w:ind w:left="2874" w:hanging="180"/>
+      </w:pPr>
+    </w:lvl>
+    <w:lvl w:ilvl="3" w:tplc="0416000F" w:tentative="1">
+      <w:start w:val="1"/>
+      <w:numFmt w:val="decimal"/>
+      <w:lvlText w:val="%4."/>
+      <w:lvlJc w:val="left"/>
+      <w:pPr>
+        <w:ind w:left="3594" w:hanging="360"/>
+      </w:pPr>
+    </w:lvl>
+    <w:lvl w:ilvl="4" w:tplc="04160019" w:tentative="1">
+      <w:start w:val="1"/>
+      <w:numFmt w:val="lowerLetter"/>
+      <w:lvlText w:val="%5."/>
+      <w:lvlJc w:val="left"/>
+      <w:pPr>
+        <w:ind w:left="4314" w:hanging="360"/>
+      </w:pPr>
+    </w:lvl>
+    <w:lvl w:ilvl="5" w:tplc="0416001B" w:tentative="1">
+      <w:start w:val="1"/>
+      <w:numFmt w:val="lowerRoman"/>
+      <w:lvlText w:val="%6."/>
+      <w:lvlJc w:val="right"/>
+      <w:pPr>
+        <w:ind w:left="5034" w:hanging="180"/>
+      </w:pPr>
+    </w:lvl>
+    <w:lvl w:ilvl="6" w:tplc="0416000F" w:tentative="1">
+      <w:start w:val="1"/>
+      <w:numFmt w:val="decimal"/>
+      <w:lvlText w:val="%7."/>
+      <w:lvlJc w:val="left"/>
+      <w:pPr>
+        <w:ind w:left="5754" w:hanging="360"/>
+      </w:pPr>
+    </w:lvl>
+    <w:lvl w:ilvl="7" w:tplc="04160019" w:tentative="1">
+      <w:start w:val="1"/>
+      <w:numFmt w:val="lowerLetter"/>
+      <w:lvlText w:val="%8."/>
+      <w:lvlJc w:val="left"/>
+      <w:pPr>
+        <w:ind w:left="6474" w:hanging="360"/>
+      </w:pPr>
+    </w:lvl>
+    <w:lvl w:ilvl="8" w:tplc="0416001B" w:tentative="1">
+      <w:start w:val="1"/>
+      <w:numFmt w:val="lowerRoman"/>
+      <w:lvlText w:val="%9."/>
+      <w:lvlJc w:val="right"/>
+      <w:pPr>
+        <w:ind w:left="7194" w:hanging="180"/>
+      </w:pPr>
+    </w:lvl>
+  </w:abstractNum>
+  <w:abstractNum w:abstractNumId="12" w15:restartNumberingAfterBreak="0">
     <w:nsid w:val="4FD43D40"/>
     <w:multiLevelType w:val="hybridMultilevel"/>
     <w:tmpl w:val="0F5C9668"/>
@@ -2916,14 +4153,311 @@
       </w:rPr>
     </w:lvl>
   </w:abstractNum>
+  <w:abstractNum w:abstractNumId="13" w15:restartNumberingAfterBreak="0">
+    <w:nsid w:val="561F3010"/>
+    <w:multiLevelType w:val="hybridMultilevel"/>
+    <w:tmpl w:val="72221EE2"/>
+    <w:lvl w:ilvl="0" w:tplc="FFFFFFFF">
+      <w:start w:val="1"/>
+      <w:numFmt w:val="lowerLetter"/>
+      <w:lvlText w:val="%1)"/>
+      <w:lvlJc w:val="left"/>
+      <w:pPr>
+        <w:ind w:left="1434" w:hanging="360"/>
+      </w:pPr>
+    </w:lvl>
+    <w:lvl w:ilvl="1" w:tplc="FFFFFFFF" w:tentative="1">
+      <w:start w:val="1"/>
+      <w:numFmt w:val="lowerLetter"/>
+      <w:lvlText w:val="%2."/>
+      <w:lvlJc w:val="left"/>
+      <w:pPr>
+        <w:ind w:left="2154" w:hanging="360"/>
+      </w:pPr>
+    </w:lvl>
+    <w:lvl w:ilvl="2" w:tplc="FFFFFFFF" w:tentative="1">
+      <w:start w:val="1"/>
+      <w:numFmt w:val="lowerRoman"/>
+      <w:lvlText w:val="%3."/>
+      <w:lvlJc w:val="right"/>
+      <w:pPr>
+        <w:ind w:left="2874" w:hanging="180"/>
+      </w:pPr>
+    </w:lvl>
+    <w:lvl w:ilvl="3" w:tplc="FFFFFFFF" w:tentative="1">
+      <w:start w:val="1"/>
+      <w:numFmt w:val="decimal"/>
+      <w:lvlText w:val="%4."/>
+      <w:lvlJc w:val="left"/>
+      <w:pPr>
+        <w:ind w:left="3594" w:hanging="360"/>
+      </w:pPr>
+    </w:lvl>
+    <w:lvl w:ilvl="4" w:tplc="FFFFFFFF" w:tentative="1">
+      <w:start w:val="1"/>
+      <w:numFmt w:val="lowerLetter"/>
+      <w:lvlText w:val="%5."/>
+      <w:lvlJc w:val="left"/>
+      <w:pPr>
+        <w:ind w:left="4314" w:hanging="360"/>
+      </w:pPr>
+    </w:lvl>
+    <w:lvl w:ilvl="5" w:tplc="FFFFFFFF" w:tentative="1">
+      <w:start w:val="1"/>
+      <w:numFmt w:val="lowerRoman"/>
+      <w:lvlText w:val="%6."/>
+      <w:lvlJc w:val="right"/>
+      <w:pPr>
+        <w:ind w:left="5034" w:hanging="180"/>
+      </w:pPr>
+    </w:lvl>
+    <w:lvl w:ilvl="6" w:tplc="FFFFFFFF" w:tentative="1">
+      <w:start w:val="1"/>
+      <w:numFmt w:val="decimal"/>
+      <w:lvlText w:val="%7."/>
+      <w:lvlJc w:val="left"/>
+      <w:pPr>
+        <w:ind w:left="5754" w:hanging="360"/>
+      </w:pPr>
+    </w:lvl>
+    <w:lvl w:ilvl="7" w:tplc="FFFFFFFF" w:tentative="1">
+      <w:start w:val="1"/>
+      <w:numFmt w:val="lowerLetter"/>
+      <w:lvlText w:val="%8."/>
+      <w:lvlJc w:val="left"/>
+      <w:pPr>
+        <w:ind w:left="6474" w:hanging="360"/>
+      </w:pPr>
+    </w:lvl>
+    <w:lvl w:ilvl="8" w:tplc="FFFFFFFF" w:tentative="1">
+      <w:start w:val="1"/>
+      <w:numFmt w:val="lowerRoman"/>
+      <w:lvlText w:val="%9."/>
+      <w:lvlJc w:val="right"/>
+      <w:pPr>
+        <w:ind w:left="7194" w:hanging="180"/>
+      </w:pPr>
+    </w:lvl>
+  </w:abstractNum>
+  <w:abstractNum w:abstractNumId="14" w15:restartNumberingAfterBreak="0">
+    <w:nsid w:val="6B375D8D"/>
+    <w:multiLevelType w:val="hybridMultilevel"/>
+    <w:tmpl w:val="72221EE2"/>
+    <w:lvl w:ilvl="0" w:tplc="FFFFFFFF">
+      <w:start w:val="1"/>
+      <w:numFmt w:val="lowerLetter"/>
+      <w:lvlText w:val="%1)"/>
+      <w:lvlJc w:val="left"/>
+      <w:pPr>
+        <w:ind w:left="1434" w:hanging="360"/>
+      </w:pPr>
+    </w:lvl>
+    <w:lvl w:ilvl="1" w:tplc="FFFFFFFF" w:tentative="1">
+      <w:start w:val="1"/>
+      <w:numFmt w:val="lowerLetter"/>
+      <w:lvlText w:val="%2."/>
+      <w:lvlJc w:val="left"/>
+      <w:pPr>
+        <w:ind w:left="2154" w:hanging="360"/>
+      </w:pPr>
+    </w:lvl>
+    <w:lvl w:ilvl="2" w:tplc="FFFFFFFF" w:tentative="1">
+      <w:start w:val="1"/>
+      <w:numFmt w:val="lowerRoman"/>
+      <w:lvlText w:val="%3."/>
+      <w:lvlJc w:val="right"/>
+      <w:pPr>
+        <w:ind w:left="2874" w:hanging="180"/>
+      </w:pPr>
+    </w:lvl>
+    <w:lvl w:ilvl="3" w:tplc="FFFFFFFF" w:tentative="1">
+      <w:start w:val="1"/>
+      <w:numFmt w:val="decimal"/>
+      <w:lvlText w:val="%4."/>
+      <w:lvlJc w:val="left"/>
+      <w:pPr>
+        <w:ind w:left="3594" w:hanging="360"/>
+      </w:pPr>
+    </w:lvl>
+    <w:lvl w:ilvl="4" w:tplc="FFFFFFFF" w:tentative="1">
+      <w:start w:val="1"/>
+      <w:numFmt w:val="lowerLetter"/>
+      <w:lvlText w:val="%5."/>
+      <w:lvlJc w:val="left"/>
+      <w:pPr>
+        <w:ind w:left="4314" w:hanging="360"/>
+      </w:pPr>
+    </w:lvl>
+    <w:lvl w:ilvl="5" w:tplc="FFFFFFFF" w:tentative="1">
+      <w:start w:val="1"/>
+      <w:numFmt w:val="lowerRoman"/>
+      <w:lvlText w:val="%6."/>
+      <w:lvlJc w:val="right"/>
+      <w:pPr>
+        <w:ind w:left="5034" w:hanging="180"/>
+      </w:pPr>
+    </w:lvl>
+    <w:lvl w:ilvl="6" w:tplc="FFFFFFFF" w:tentative="1">
+      <w:start w:val="1"/>
+      <w:numFmt w:val="decimal"/>
+      <w:lvlText w:val="%7."/>
+      <w:lvlJc w:val="left"/>
+      <w:pPr>
+        <w:ind w:left="5754" w:hanging="360"/>
+      </w:pPr>
+    </w:lvl>
+    <w:lvl w:ilvl="7" w:tplc="FFFFFFFF" w:tentative="1">
+      <w:start w:val="1"/>
+      <w:numFmt w:val="lowerLetter"/>
+      <w:lvlText w:val="%8."/>
+      <w:lvlJc w:val="left"/>
+      <w:pPr>
+        <w:ind w:left="6474" w:hanging="360"/>
+      </w:pPr>
+    </w:lvl>
+    <w:lvl w:ilvl="8" w:tplc="FFFFFFFF" w:tentative="1">
+      <w:start w:val="1"/>
+      <w:numFmt w:val="lowerRoman"/>
+      <w:lvlText w:val="%9."/>
+      <w:lvlJc w:val="right"/>
+      <w:pPr>
+        <w:ind w:left="7194" w:hanging="180"/>
+      </w:pPr>
+    </w:lvl>
+  </w:abstractNum>
+  <w:abstractNum w:abstractNumId="15" w15:restartNumberingAfterBreak="0">
+    <w:nsid w:val="743B46F0"/>
+    <w:multiLevelType w:val="hybridMultilevel"/>
+    <w:tmpl w:val="33DA9EE0"/>
+    <w:lvl w:ilvl="0" w:tplc="04160017">
+      <w:start w:val="1"/>
+      <w:numFmt w:val="lowerLetter"/>
+      <w:lvlText w:val="%1)"/>
+      <w:lvlJc w:val="left"/>
+      <w:pPr>
+        <w:ind w:left="1434" w:hanging="360"/>
+      </w:pPr>
+    </w:lvl>
+    <w:lvl w:ilvl="1" w:tplc="04160019" w:tentative="1">
+      <w:start w:val="1"/>
+      <w:numFmt w:val="lowerLetter"/>
+      <w:lvlText w:val="%2."/>
+      <w:lvlJc w:val="left"/>
+      <w:pPr>
+        <w:ind w:left="2154" w:hanging="360"/>
+      </w:pPr>
+    </w:lvl>
+    <w:lvl w:ilvl="2" w:tplc="0416001B" w:tentative="1">
+      <w:start w:val="1"/>
+      <w:numFmt w:val="lowerRoman"/>
+      <w:lvlText w:val="%3."/>
+      <w:lvlJc w:val="right"/>
+      <w:pPr>
+        <w:ind w:left="2874" w:hanging="180"/>
+      </w:pPr>
+    </w:lvl>
+    <w:lvl w:ilvl="3" w:tplc="0416000F" w:tentative="1">
+      <w:start w:val="1"/>
+      <w:numFmt w:val="decimal"/>
+      <w:lvlText w:val="%4."/>
+      <w:lvlJc w:val="left"/>
+      <w:pPr>
+        <w:ind w:left="3594" w:hanging="360"/>
+      </w:pPr>
+    </w:lvl>
+    <w:lvl w:ilvl="4" w:tplc="04160019" w:tentative="1">
+      <w:start w:val="1"/>
+      <w:numFmt w:val="lowerLetter"/>
+      <w:lvlText w:val="%5."/>
+      <w:lvlJc w:val="left"/>
+      <w:pPr>
+        <w:ind w:left="4314" w:hanging="360"/>
+      </w:pPr>
+    </w:lvl>
+    <w:lvl w:ilvl="5" w:tplc="0416001B" w:tentative="1">
+      <w:start w:val="1"/>
+      <w:numFmt w:val="lowerRoman"/>
+      <w:lvlText w:val="%6."/>
+      <w:lvlJc w:val="right"/>
+      <w:pPr>
+        <w:ind w:left="5034" w:hanging="180"/>
+      </w:pPr>
+    </w:lvl>
+    <w:lvl w:ilvl="6" w:tplc="0416000F" w:tentative="1">
+      <w:start w:val="1"/>
+      <w:numFmt w:val="decimal"/>
+      <w:lvlText w:val="%7."/>
+      <w:lvlJc w:val="left"/>
+      <w:pPr>
+        <w:ind w:left="5754" w:hanging="360"/>
+      </w:pPr>
+    </w:lvl>
+    <w:lvl w:ilvl="7" w:tplc="04160019" w:tentative="1">
+      <w:start w:val="1"/>
+      <w:numFmt w:val="lowerLetter"/>
+      <w:lvlText w:val="%8."/>
+      <w:lvlJc w:val="left"/>
+      <w:pPr>
+        <w:ind w:left="6474" w:hanging="360"/>
+      </w:pPr>
+    </w:lvl>
+    <w:lvl w:ilvl="8" w:tplc="0416001B" w:tentative="1">
+      <w:start w:val="1"/>
+      <w:numFmt w:val="lowerRoman"/>
+      <w:lvlText w:val="%9."/>
+      <w:lvlJc w:val="right"/>
+      <w:pPr>
+        <w:ind w:left="7194" w:hanging="180"/>
+      </w:pPr>
+    </w:lvl>
+  </w:abstractNum>
   <w:num w:numId="1" w16cid:durableId="1496726630">
+    <w:abstractNumId w:val="12"/>
+  </w:num>
+  <w:num w:numId="2" w16cid:durableId="1858957494">
+    <w:abstractNumId w:val="9"/>
+  </w:num>
+  <w:num w:numId="3" w16cid:durableId="592397436">
+    <w:abstractNumId w:val="5"/>
+  </w:num>
+  <w:num w:numId="4" w16cid:durableId="794131123">
+    <w:abstractNumId w:val="15"/>
+  </w:num>
+  <w:num w:numId="5" w16cid:durableId="1441144690">
+    <w:abstractNumId w:val="1"/>
+  </w:num>
+  <w:num w:numId="6" w16cid:durableId="777063852">
+    <w:abstractNumId w:val="8"/>
+  </w:num>
+  <w:num w:numId="7" w16cid:durableId="811674164">
+    <w:abstractNumId w:val="11"/>
+  </w:num>
+  <w:num w:numId="8" w16cid:durableId="1437367012">
+    <w:abstractNumId w:val="7"/>
+  </w:num>
+  <w:num w:numId="9" w16cid:durableId="1111558231">
+    <w:abstractNumId w:val="14"/>
+  </w:num>
+  <w:num w:numId="10" w16cid:durableId="1440102889">
     <w:abstractNumId w:val="2"/>
   </w:num>
-  <w:num w:numId="2" w16cid:durableId="1858957494">
-    <w:abstractNumId w:val="1"/>
+  <w:num w:numId="11" w16cid:durableId="1287200945">
+    <w:abstractNumId w:val="6"/>
   </w:num>
-  <w:num w:numId="3" w16cid:durableId="592397436">
+  <w:num w:numId="12" w16cid:durableId="1911844476">
     <w:abstractNumId w:val="0"/>
+  </w:num>
+  <w:num w:numId="13" w16cid:durableId="838160393">
+    <w:abstractNumId w:val="4"/>
+  </w:num>
+  <w:num w:numId="14" w16cid:durableId="367098457">
+    <w:abstractNumId w:val="13"/>
+  </w:num>
+  <w:num w:numId="15" w16cid:durableId="346256502">
+    <w:abstractNumId w:val="3"/>
+  </w:num>
+  <w:num w:numId="16" w16cid:durableId="1795058536">
+    <w:abstractNumId w:val="10"/>
   </w:num>
 </w:numbering>
 </file>
@@ -3531,7 +5065,6 @@
   <w:style w:type="character" w:default="1" w:styleId="Fontepargpadro">
     <w:name w:val="Default Paragraph Font"/>
     <w:uiPriority w:val="1"/>
-    <w:semiHidden/>
     <w:unhideWhenUsed/>
   </w:style>
   <w:style w:type="table" w:default="1" w:styleId="Tabelanormal">

</xml_diff>